<commit_message>
Verktoykassen som lesevisninger, bygget fra md
Co-Authored-By: Claude Opus 5 <noreply@anthropic.com>
</commit_message>
<xml_diff>
--- a/Arshjul og tilskuddskalender.docx
+++ b/Arshjul og tilskuddskalender.docx
@@ -69,7 +69,7 @@
             <w:color w:val="2F6B45"/>
             <w:sz w:val="21"/>
           </w:rPr>
-          <w:t xml:space="preserve">⚠️ Haster nå (høsten 2026)</w:t>
+          <w:t xml:space="preserve">Det som gjenstår i 2026</w:t>
         </w:r>
       </w:hyperlink>
     </w:p>
@@ -326,9 +326,18 @@
           <w:color w:val="1F7A4D"/>
           <w:sz w:val="28"/>
         </w:rPr>
-        <w:t>⚠️ Haster nå (høsten 2026)</w:t>
+        <w:t>Det som gjenstår i 2026</w:t>
       </w:r>
       <w:bookmarkEnd w:id="1001"/>
+    </w:p>
+    <w:p>
+      <w:r>
+        <w:rPr>
+          <w:b w:val="0"/>
+          <w:i w:val="0"/>
+        </w:rPr>
+        <w:t>Rekkefølgen er etter dato. Alt her er fortsatt mulig å rekke.</w:t>
+      </w:r>
     </w:p>
     <w:tbl>
       <w:tblPr>
@@ -346,9 +355,10 @@
         </w:tblBorders>
       </w:tblPr>
       <w:tblGrid>
-        <w:gridCol w:w="3024"/>
-        <w:gridCol w:w="3024"/>
-        <w:gridCol w:w="3024"/>
+        <w:gridCol w:w="2268"/>
+        <w:gridCol w:w="2268"/>
+        <w:gridCol w:w="2268"/>
+        <w:gridCol w:w="2268"/>
       </w:tblGrid>
       <w:tr>
         <w:trPr>
@@ -357,7 +367,7 @@
         </w:trPr>
         <w:tc>
           <w:tcPr>
-            <w:tcW w:type="dxa" w:w="3024"/>
+            <w:tcW w:type="dxa" w:w="2268"/>
             <w:shd w:val="clear" w:color="auto" w:fill="E9F2EC"/>
           </w:tcPr>
           <w:p>
@@ -382,7 +392,7 @@
         </w:tc>
         <w:tc>
           <w:tcPr>
-            <w:tcW w:type="dxa" w:w="3024"/>
+            <w:tcW w:type="dxa" w:w="2268"/>
             <w:shd w:val="clear" w:color="auto" w:fill="E9F2EC"/>
           </w:tcPr>
           <w:p>
@@ -407,7 +417,32 @@
         </w:tc>
         <w:tc>
           <w:tcPr>
-            <w:tcW w:type="dxa" w:w="3024"/>
+            <w:tcW w:type="dxa" w:w="2268"/>
+            <w:shd w:val="clear" w:color="auto" w:fill="E9F2EC"/>
+          </w:tcPr>
+          <w:p>
+            <w:pPr>
+              <w:spacing w:before="60" w:after="60"/>
+            </w:pPr>
+            <w:r>
+              <w:rPr>
+                <w:b/>
+              </w:rPr>
+            </w:r>
+            <w:r>
+              <w:rPr>
+                <w:b/>
+                <w:i w:val="0"/>
+                <w:color w:val="14532D"/>
+                <w:sz w:val="21"/>
+              </w:rPr>
+              <w:t>Gjelder</w:t>
+            </w:r>
+          </w:p>
+        </w:tc>
+        <w:tc>
+          <w:tcPr>
+            <w:tcW w:type="dxa" w:w="2268"/>
             <w:shd w:val="clear" w:color="auto" w:fill="E9F2EC"/>
           </w:tcPr>
           <w:p>
@@ -437,7 +472,7 @@
         </w:trPr>
         <w:tc>
           <w:tcPr>
-            <w:tcW w:type="dxa" w:w="3024"/>
+            <w:tcW w:type="dxa" w:w="2268"/>
           </w:tcPr>
           <w:p>
             <w:pPr>
@@ -454,13 +489,13 @@
                 <w:i w:val="0"/>
                 <w:sz w:val="21"/>
               </w:rPr>
-              <w:t>1. september 2026, kl. 16:00</w:t>
+              <w:t>1. oktober</w:t>
             </w:r>
           </w:p>
         </w:tc>
         <w:tc>
           <w:tcPr>
-            <w:tcW w:type="dxa" w:w="3024"/>
+            <w:tcW w:type="dxa" w:w="2268"/>
           </w:tcPr>
           <w:p>
             <w:pPr>
@@ -477,13 +512,13 @@
                 <w:i w:val="0"/>
                 <w:sz w:val="21"/>
               </w:rPr>
-              <w:t>Gjensidigestiftelsens høstutlysning</w:t>
+              <w:t>SpareBank 1 Nord-Norge, Samfunnsløftet</w:t>
             </w:r>
           </w:p>
         </w:tc>
         <w:tc>
           <w:tcPr>
-            <w:tcW w:type="dxa" w:w="3024"/>
+            <w:tcW w:type="dxa" w:w="2268"/>
           </w:tcPr>
           <w:p>
             <w:pPr>
@@ -500,7 +535,30 @@
                 <w:i w:val="0"/>
                 <w:sz w:val="21"/>
               </w:rPr>
-              <w:t>30 000–800 000 kr. Tiltaket må starte i 2027, ikke i høst</w:t>
+              <w:t>Ishavsbyen</w:t>
+            </w:r>
+          </w:p>
+        </w:tc>
+        <w:tc>
+          <w:tcPr>
+            <w:tcW w:type="dxa" w:w="2268"/>
+          </w:tcPr>
+          <w:p>
+            <w:pPr>
+              <w:spacing w:before="60" w:after="60"/>
+            </w:pPr>
+            <w:r>
+              <w:rPr>
+                <w:sz w:val="21"/>
+              </w:rPr>
+            </w:r>
+            <w:r>
+              <w:rPr>
+                <w:b w:val="0"/>
+                <w:i w:val="0"/>
+                <w:sz w:val="21"/>
+              </w:rPr>
+              <w:t>Tre utlysninger i året</w:t>
             </w:r>
           </w:p>
         </w:tc>
@@ -511,7 +569,31 @@
         </w:trPr>
         <w:tc>
           <w:tcPr>
-            <w:tcW w:type="dxa" w:w="3024"/>
+            <w:tcW w:type="dxa" w:w="2268"/>
+            <w:shd w:val="clear" w:color="auto" w:fill="F5F9F6"/>
+          </w:tcPr>
+          <w:p>
+            <w:pPr>
+              <w:spacing w:before="60" w:after="60"/>
+            </w:pPr>
+            <w:r>
+              <w:rPr>
+                <w:sz w:val="21"/>
+              </w:rPr>
+            </w:r>
+            <w:r>
+              <w:rPr>
+                <w:b/>
+                <w:i w:val="0"/>
+                <w:sz w:val="21"/>
+              </w:rPr>
+              <w:t>31. oktober / 1. november</w:t>
+            </w:r>
+          </w:p>
+        </w:tc>
+        <w:tc>
+          <w:tcPr>
+            <w:tcW w:type="dxa" w:w="2268"/>
             <w:shd w:val="clear" w:color="auto" w:fill="F5F9F6"/>
           </w:tcPr>
           <w:p>
@@ -529,13 +611,13 @@
                 <w:i w:val="0"/>
                 <w:sz w:val="21"/>
               </w:rPr>
-              <w:t>Løper nå, til 15. november</w:t>
+              <w:t>Bufdir — inkludering av barn og unge</w:t>
             </w:r>
           </w:p>
         </w:tc>
         <w:tc>
           <w:tcPr>
-            <w:tcW w:type="dxa" w:w="3024"/>
+            <w:tcW w:type="dxa" w:w="2268"/>
             <w:shd w:val="clear" w:color="auto" w:fill="F5F9F6"/>
           </w:tcPr>
           <w:p>
@@ -553,13 +635,211 @@
                 <w:i w:val="0"/>
                 <w:sz w:val="21"/>
               </w:rPr>
-              <w:t>LAM-fordelingen i kommunens idrettsråd</w:t>
+              <w:t>Alle</w:t>
             </w:r>
           </w:p>
         </w:tc>
         <w:tc>
           <w:tcPr>
-            <w:tcW w:type="dxa" w:w="3024"/>
+            <w:tcW w:type="dxa" w:w="2268"/>
+            <w:shd w:val="clear" w:color="auto" w:fill="F5F9F6"/>
+          </w:tcPr>
+          <w:p>
+            <w:pPr>
+              <w:spacing w:before="60" w:after="60"/>
+            </w:pPr>
+            <w:r>
+              <w:rPr>
+                <w:sz w:val="21"/>
+              </w:rPr>
+            </w:r>
+            <w:r>
+              <w:rPr>
+                <w:b w:val="0"/>
+                <w:i w:val="0"/>
+                <w:sz w:val="21"/>
+              </w:rPr>
+              <w:t>Den største enkeltpotten som passer rekrutteringsarbeid</w:t>
+            </w:r>
+          </w:p>
+        </w:tc>
+      </w:tr>
+      <w:tr>
+        <w:trPr>
+          <w:cantSplit/>
+        </w:trPr>
+        <w:tc>
+          <w:tcPr>
+            <w:tcW w:type="dxa" w:w="2268"/>
+          </w:tcPr>
+          <w:p>
+            <w:pPr>
+              <w:spacing w:before="60" w:after="60"/>
+            </w:pPr>
+            <w:r>
+              <w:rPr>
+                <w:sz w:val="21"/>
+              </w:rPr>
+            </w:r>
+            <w:r>
+              <w:rPr>
+                <w:b/>
+                <w:i w:val="0"/>
+                <w:sz w:val="21"/>
+              </w:rPr>
+              <w:t>15. november</w:t>
+            </w:r>
+          </w:p>
+        </w:tc>
+        <w:tc>
+          <w:tcPr>
+            <w:tcW w:type="dxa" w:w="2268"/>
+          </w:tcPr>
+          <w:p>
+            <w:pPr>
+              <w:spacing w:before="60" w:after="60"/>
+            </w:pPr>
+            <w:r>
+              <w:rPr>
+                <w:sz w:val="21"/>
+              </w:rPr>
+            </w:r>
+            <w:r>
+              <w:rPr>
+                <w:b w:val="0"/>
+                <w:i w:val="0"/>
+                <w:sz w:val="21"/>
+              </w:rPr>
+              <w:t>Sparebankstiftelsen Helgeland</w:t>
+            </w:r>
+          </w:p>
+        </w:tc>
+        <w:tc>
+          <w:tcPr>
+            <w:tcW w:type="dxa" w:w="2268"/>
+          </w:tcPr>
+          <w:p>
+            <w:pPr>
+              <w:spacing w:before="60" w:after="60"/>
+            </w:pPr>
+            <w:r>
+              <w:rPr>
+                <w:sz w:val="21"/>
+              </w:rPr>
+            </w:r>
+            <w:r>
+              <w:rPr>
+                <w:b w:val="0"/>
+                <w:i w:val="0"/>
+                <w:sz w:val="21"/>
+              </w:rPr>
+              <w:t>Helgeland</w:t>
+            </w:r>
+          </w:p>
+        </w:tc>
+        <w:tc>
+          <w:tcPr>
+            <w:tcW w:type="dxa" w:w="2268"/>
+          </w:tcPr>
+          <w:p>
+            <w:pPr>
+              <w:spacing w:before="60" w:after="60"/>
+            </w:pPr>
+            <w:r>
+              <w:rPr>
+                <w:sz w:val="21"/>
+              </w:rPr>
+            </w:r>
+            <w:r>
+              <w:rPr>
+                <w:b w:val="0"/>
+                <w:i w:val="0"/>
+                <w:sz w:val="21"/>
+              </w:rPr>
+              <w:t>Fjerde og siste frist i året</w:t>
+            </w:r>
+          </w:p>
+        </w:tc>
+      </w:tr>
+      <w:tr>
+        <w:trPr>
+          <w:cantSplit/>
+        </w:trPr>
+        <w:tc>
+          <w:tcPr>
+            <w:tcW w:type="dxa" w:w="2268"/>
+            <w:shd w:val="clear" w:color="auto" w:fill="F5F9F6"/>
+          </w:tcPr>
+          <w:p>
+            <w:pPr>
+              <w:spacing w:before="60" w:after="60"/>
+            </w:pPr>
+            <w:r>
+              <w:rPr>
+                <w:sz w:val="21"/>
+              </w:rPr>
+            </w:r>
+            <w:r>
+              <w:rPr>
+                <w:b/>
+                <w:i w:val="0"/>
+                <w:sz w:val="21"/>
+              </w:rPr>
+              <w:t>15. november</w:t>
+            </w:r>
+          </w:p>
+        </w:tc>
+        <w:tc>
+          <w:tcPr>
+            <w:tcW w:type="dxa" w:w="2268"/>
+            <w:shd w:val="clear" w:color="auto" w:fill="F5F9F6"/>
+          </w:tcPr>
+          <w:p>
+            <w:pPr>
+              <w:spacing w:before="60" w:after="60"/>
+            </w:pPr>
+            <w:r>
+              <w:rPr>
+                <w:sz w:val="21"/>
+              </w:rPr>
+            </w:r>
+            <w:r>
+              <w:rPr>
+                <w:b w:val="0"/>
+                <w:i w:val="0"/>
+                <w:sz w:val="21"/>
+              </w:rPr>
+              <w:t>Idrettsrådets LAM-fordeling</w:t>
+            </w:r>
+          </w:p>
+        </w:tc>
+        <w:tc>
+          <w:tcPr>
+            <w:tcW w:type="dxa" w:w="2268"/>
+            <w:shd w:val="clear" w:color="auto" w:fill="F5F9F6"/>
+          </w:tcPr>
+          <w:p>
+            <w:pPr>
+              <w:spacing w:before="60" w:after="60"/>
+            </w:pPr>
+            <w:r>
+              <w:rPr>
+                <w:sz w:val="21"/>
+              </w:rPr>
+            </w:r>
+            <w:r>
+              <w:rPr>
+                <w:b w:val="0"/>
+                <w:i w:val="0"/>
+                <w:sz w:val="21"/>
+              </w:rPr>
+              <w:t>Alle</w:t>
+            </w:r>
+          </w:p>
+        </w:tc>
+        <w:tc>
+          <w:tcPr>
+            <w:tcW w:type="dxa" w:w="2268"/>
             <w:shd w:val="clear" w:color="auto" w:fill="F5F9F6"/>
           </w:tcPr>
           <w:p>
@@ -582,29 +862,209 @@
           </w:p>
         </w:tc>
       </w:tr>
+      <w:tr>
+        <w:trPr>
+          <w:cantSplit/>
+        </w:trPr>
+        <w:tc>
+          <w:tcPr>
+            <w:tcW w:type="dxa" w:w="2268"/>
+          </w:tcPr>
+          <w:p>
+            <w:pPr>
+              <w:spacing w:before="60" w:after="60"/>
+            </w:pPr>
+            <w:r>
+              <w:rPr>
+                <w:sz w:val="21"/>
+              </w:rPr>
+            </w:r>
+            <w:r>
+              <w:rPr>
+                <w:b/>
+                <w:i w:val="0"/>
+                <w:sz w:val="21"/>
+              </w:rPr>
+              <w:t>1. desember</w:t>
+            </w:r>
+          </w:p>
+        </w:tc>
+        <w:tc>
+          <w:tcPr>
+            <w:tcW w:type="dxa" w:w="2268"/>
+          </w:tcPr>
+          <w:p>
+            <w:pPr>
+              <w:spacing w:before="60" w:after="60"/>
+            </w:pPr>
+            <w:r>
+              <w:rPr>
+                <w:sz w:val="21"/>
+              </w:rPr>
+            </w:r>
+            <w:r>
+              <w:rPr>
+                <w:b w:val="0"/>
+                <w:i w:val="0"/>
+                <w:sz w:val="21"/>
+              </w:rPr>
+              <w:t>Momskompensasjon ved bygging og rehabilitering</w:t>
+            </w:r>
+          </w:p>
+        </w:tc>
+        <w:tc>
+          <w:tcPr>
+            <w:tcW w:type="dxa" w:w="2268"/>
+          </w:tcPr>
+          <w:p>
+            <w:pPr>
+              <w:spacing w:before="60" w:after="60"/>
+            </w:pPr>
+            <w:r>
+              <w:rPr>
+                <w:sz w:val="21"/>
+              </w:rPr>
+            </w:r>
+            <w:r>
+              <w:rPr>
+                <w:b w:val="0"/>
+                <w:i w:val="0"/>
+                <w:sz w:val="21"/>
+              </w:rPr>
+              <w:t>Kun klubber som har bygget</w:t>
+            </w:r>
+          </w:p>
+        </w:tc>
+        <w:tc>
+          <w:tcPr>
+            <w:tcW w:type="dxa" w:w="2268"/>
+          </w:tcPr>
+          <w:p>
+            <w:pPr>
+              <w:spacing w:before="60" w:after="60"/>
+            </w:pPr>
+            <w:r>
+              <w:rPr>
+                <w:sz w:val="21"/>
+              </w:rPr>
+            </w:r>
+            <w:r>
+              <w:rPr>
+                <w:b w:val="0"/>
+                <w:i w:val="0"/>
+                <w:sz w:val="21"/>
+              </w:rPr>
+              <w:t>Lotteri- og stiftelsestilsynet</w:t>
+            </w:r>
+          </w:p>
+        </w:tc>
+      </w:tr>
+      <w:tr>
+        <w:trPr>
+          <w:cantSplit/>
+        </w:trPr>
+        <w:tc>
+          <w:tcPr>
+            <w:tcW w:type="dxa" w:w="2268"/>
+            <w:shd w:val="clear" w:color="auto" w:fill="F5F9F6"/>
+          </w:tcPr>
+          <w:p>
+            <w:pPr>
+              <w:spacing w:before="60" w:after="60"/>
+            </w:pPr>
+            <w:r>
+              <w:rPr>
+                <w:sz w:val="21"/>
+              </w:rPr>
+            </w:r>
+            <w:r>
+              <w:rPr>
+                <w:b w:val="0"/>
+                <w:i w:val="0"/>
+                <w:sz w:val="21"/>
+              </w:rPr>
+              <w:t>November–desember</w:t>
+            </w:r>
+          </w:p>
+        </w:tc>
+        <w:tc>
+          <w:tcPr>
+            <w:tcW w:type="dxa" w:w="2268"/>
+            <w:shd w:val="clear" w:color="auto" w:fill="F5F9F6"/>
+          </w:tcPr>
+          <w:p>
+            <w:pPr>
+              <w:spacing w:before="60" w:after="60"/>
+            </w:pPr>
+            <w:r>
+              <w:rPr>
+                <w:sz w:val="21"/>
+              </w:rPr>
+            </w:r>
+            <w:r>
+              <w:rPr>
+                <w:b w:val="0"/>
+                <w:i w:val="0"/>
+                <w:sz w:val="21"/>
+              </w:rPr>
+              <w:t>Sponsoravtaler for neste år</w:t>
+            </w:r>
+          </w:p>
+        </w:tc>
+        <w:tc>
+          <w:tcPr>
+            <w:tcW w:type="dxa" w:w="2268"/>
+            <w:shd w:val="clear" w:color="auto" w:fill="F5F9F6"/>
+          </w:tcPr>
+          <w:p>
+            <w:pPr>
+              <w:spacing w:before="60" w:after="60"/>
+            </w:pPr>
+            <w:r>
+              <w:rPr>
+                <w:sz w:val="21"/>
+              </w:rPr>
+            </w:r>
+            <w:r>
+              <w:rPr>
+                <w:b w:val="0"/>
+                <w:i w:val="0"/>
+                <w:sz w:val="21"/>
+              </w:rPr>
+              <w:t>Alle</w:t>
+            </w:r>
+          </w:p>
+        </w:tc>
+        <w:tc>
+          <w:tcPr>
+            <w:tcW w:type="dxa" w:w="2268"/>
+            <w:shd w:val="clear" w:color="auto" w:fill="F5F9F6"/>
+          </w:tcPr>
+          <w:p>
+            <w:pPr>
+              <w:spacing w:before="60" w:after="60"/>
+            </w:pPr>
+            <w:r>
+              <w:rPr>
+                <w:sz w:val="21"/>
+              </w:rPr>
+            </w:r>
+            <w:r>
+              <w:rPr>
+                <w:b w:val="0"/>
+                <w:i w:val="0"/>
+                <w:sz w:val="21"/>
+              </w:rPr>
+              <w:t>Bedrifter legger markedsbudsjett nå</w:t>
+            </w:r>
+          </w:p>
+        </w:tc>
+      </w:tr>
     </w:tbl>
     <w:p>
       <w:pPr>
         <w:spacing w:after="120"/>
       </w:pPr>
-    </w:p>
-    <w:p>
-      <w:r>
-        <w:rPr>
-          <w:b w:val="0"/>
-          <w:i w:val="0"/>
-        </w:rPr>
-        <w:t>Gjensidigefristen er den eneste harde fristen igjen i 2026. Søknadspakken er ferdig skrevet — klubben fyller inn navn, tall og lokale forhold.</w:t>
-      </w:r>
-    </w:p>
-    <w:p>
-      <w:r>
-        <w:rPr>
-          <w:b w:val="0"/>
-          <w:i w:val="0"/>
-        </w:rPr>
-        <w:t>LAM krever ingen søknad i de fleste kommuner. Det som avgjør beløpet, er om medlemmene mellom 6 og 19 år står korrekt registrert med betalt kontingent. Det arbeidet gjøres nå, ikke i november.</w:t>
-      </w:r>
     </w:p>
     <w:tbl>
       <w:tblPr>
@@ -639,7 +1099,7 @@
                 <w:i w:val="0"/>
                 <w:color w:val="14532D"/>
               </w:rPr>
-              <w:t>Momskompensasjonen for 2026 er ute</w:t>
+              <w:t>LAM krever ingen søknad — men arbeidet gjøres nå</w:t>
             </w:r>
           </w:p>
           <w:p>
@@ -652,23 +1112,56 @@
                 <w:i w:val="0"/>
                 <w:color w:val="14532D"/>
               </w:rPr>
-              <w:t xml:space="preserve">Fristen var </w:t>
+              <w:t>I de fleste kommuner fordeles LAM automatisk etter medlemstall. Det som avgjør beløpet, er om medlemmene mellom 6 og 19 år står korrekt registrert med betalt kontingent. Et uregistrert medlem er verdt null kroner. Ryddingen i medlemsregisteret må skje nå, ikke i november.</w:t>
             </w:r>
+          </w:p>
+          <w:p>
+            <w:pPr>
+              <w:spacing w:after="0"/>
+            </w:pPr>
+          </w:p>
+        </w:tc>
+      </w:tr>
+    </w:tbl>
+    <w:p>
+      <w:pPr>
+        <w:spacing w:after="120"/>
+      </w:pPr>
+    </w:p>
+    <w:tbl>
+      <w:tblPr>
+        <w:tblW w:type="auto" w:w="0"/>
+        <w:tblLook w:firstColumn="1" w:firstRow="1" w:lastColumn="0" w:lastRow="0" w:noHBand="0" w:noVBand="1" w:val="04A0"/>
+        <w:tblBorders>
+          <w:left w:val="single" w:sz="24" w:space="0" w:color="3A6B4A"/>
+          <w:top w:val="none" w:sz="0" w:space="0" w:color="auto"/>
+          <w:bottom w:val="none" w:sz="0" w:space="0" w:color="auto"/>
+          <w:right w:val="none" w:sz="0" w:space="0" w:color="auto"/>
+          <w:insideH w:val="none" w:sz="0" w:space="0" w:color="auto"/>
+          <w:insideV w:val="none" w:sz="0" w:space="0" w:color="auto"/>
+        </w:tblBorders>
+      </w:tblPr>
+      <w:tblGrid>
+        <w:gridCol w:w="9072"/>
+      </w:tblGrid>
+      <w:tr>
+        <w:tc>
+          <w:tcPr>
+            <w:tcW w:type="dxa" w:w="9072"/>
+            <w:shd w:val="clear" w:color="auto" w:fill="E9F2EC"/>
+          </w:tcPr>
+          <w:p>
+            <w:pPr>
+              <w:spacing w:before="100" w:after="80"/>
+            </w:pPr>
+            <w:r/>
             <w:r>
               <w:rPr>
                 <w:b/>
                 <w:i w:val="0"/>
                 <w:color w:val="14532D"/>
               </w:rPr>
-              <w:t>15. august 2026</w:t>
-            </w:r>
-            <w:r>
-              <w:rPr>
-                <w:b w:val="0"/>
-                <w:i w:val="0"/>
-                <w:color w:val="14532D"/>
-              </w:rPr>
-              <w:t>, og det finnes ingen unntak — bommer klubben på den, er det null kroner for det året.</w:t>
+              <w:t>Gått ut i 2026</w:t>
             </w:r>
           </w:p>
           <w:p>
@@ -681,7 +1174,7 @@
                 <w:i w:val="0"/>
                 <w:color w:val="14532D"/>
               </w:rPr>
-              <w:t>Neste søknadsrunde er sommeren 2027.</w:t>
+              <w:t>Momskompensasjon på varer og tjenester, 15. august.</w:t>
             </w:r>
             <w:r>
               <w:rPr>
@@ -689,7 +1182,7 @@
                 <w:i w:val="0"/>
                 <w:color w:val="14532D"/>
               </w:rPr>
-              <w:t xml:space="preserve"> NIF har lagt fristen til 15. august de siste årene, men den bekreftes i forvaltningsportalen på våren. Behandle 15. august 2027 som et arbeidsanslag til dere har sett årets utlysning.</w:t>
+              <w:t xml:space="preserve"> Ingen unntak. Neste søknadsrunde er sommeren 2027 — NIF har lagt fristen til 15. august de siste årene, men den bekreftes i forvaltningsportalen på våren. Selve søknaden er ett tall fra det årsmøtegodkjente regnskapet: forberedelsen skjer på årsmøtet i mars.</w:t>
             </w:r>
           </w:p>
           <w:p>
@@ -698,11 +1191,19 @@
             </w:pPr>
             <w:r>
               <w:rPr>
+                <w:b/>
+                <w:i w:val="0"/>
+                <w:color w:val="14532D"/>
+              </w:rPr>
+              <w:t>Gjensidigestiftelsens høstutlysning, 1. september.</w:t>
+            </w:r>
+            <w:r>
+              <w:rPr>
                 <w:b w:val="0"/>
                 <w:i w:val="0"/>
                 <w:color w:val="14532D"/>
               </w:rPr>
-              <w:t>Selve søknaden er ett tall fra det årsmøtegodkjente regnskapet, lagt inn i NIFs forvaltningsportal — ingen prosjektbeskrivelse, ingen kreativitet. Forberedelsen skjer på årsmøtet i mars. Punktet står i 30-dagerslista nedenfor.</w:t>
+              <w:t xml:space="preserve"> Neste er sommerutlysningen i begynnelsen av mars 2027. Søknadspakken er ferdig skrevet — klubben fyller inn navn, tall og lokale forhold.</w:t>
             </w:r>
           </w:p>
           <w:p>
@@ -1332,6 +1833,15 @@
           <w:bottom w:val="single" w:sz="4" w:space="4" w:color="C6D9CC"/>
         </w:pBdr>
       </w:pPr>
+    </w:p>
+    <w:p>
+      <w:r>
+        <w:rPr>
+          <w:b w:val="0"/>
+          <w:i w:val="0"/>
+        </w:rPr>
+        <w:t>&lt;!--nett:rutenett--&gt;</w:t>
+      </w:r>
     </w:p>
     <w:p>
       <w:bookmarkStart w:id="1003" w:name="ovs4"/>

</xml_diff>

<commit_message>
Forsiden 36 bord, Sarpsborg-kontakt til Peggy, arshjulet kontrollert mot alle kilder
Co-Authored-By: Claude Opus 5 <noreply@anthropic.com>
</commit_message>
<xml_diff>
--- a/Arshjul og tilskuddskalender.docx
+++ b/Arshjul og tilskuddskalender.docx
@@ -27,7 +27,7 @@
           <w:color w:val="595959"/>
           <w:sz w:val="19"/>
         </w:rPr>
-        <w:t>Sist verifisert: 2026-08-11   ·   Status: ferdig-v1   ·   Eier: Roger</w:t>
+        <w:t>Sist verifisert: 2026-09-14   ·   Status: ferdig-v1   ·   Eier: Roger</w:t>
       </w:r>
     </w:p>
     <w:p>
@@ -144,7 +144,7 @@
             <w:color w:val="2F6B45"/>
             <w:sz w:val="21"/>
           </w:rPr>
-          <w:t xml:space="preserve">Om tallene og fristene</w:t>
+          <w:t xml:space="preserve">Hva som er kontrollert, og hva som ikke er det</w:t>
         </w:r>
       </w:hyperlink>
     </w:p>
@@ -177,7 +177,14 @@
           <w:b/>
           <w:i w:val="0"/>
         </w:rPr>
-        <w:t>Versjon 1.0 — juli 2026</w:t>
+        <w:t>Versjon 1.1 — september 2026.</w:t>
+      </w:r>
+      <w:r>
+        <w:rPr>
+          <w:b w:val="0"/>
+          <w:i w:val="0"/>
+        </w:rPr>
+        <w:t xml:space="preserve"> Alle frister kontrollert mot kildenes egne sider 14.09.2026. Se «Hva som er kontrollert» nederst.</w:t>
       </w:r>
     </w:p>
     <w:p>
@@ -558,7 +565,7 @@
                 <w:i w:val="0"/>
                 <w:sz w:val="21"/>
               </w:rPr>
-              <w:t>Tre utlysninger i året</w:t>
+              <w:t>To utlysninger i året, vår og høst. Snitt ca. 65 000 kr, maks 50 % av budsjettet</w:t>
             </w:r>
           </w:p>
         </w:tc>
@@ -587,7 +594,205 @@
                 <w:i w:val="0"/>
                 <w:sz w:val="21"/>
               </w:rPr>
-              <w:t>31. oktober / 1. november</w:t>
+              <w:t>1. oktober</w:t>
+            </w:r>
+          </w:p>
+        </w:tc>
+        <w:tc>
+          <w:tcPr>
+            <w:tcW w:type="dxa" w:w="2268"/>
+            <w:shd w:val="clear" w:color="auto" w:fill="F5F9F6"/>
+          </w:tcPr>
+          <w:p>
+            <w:pPr>
+              <w:spacing w:before="60" w:after="60"/>
+            </w:pPr>
+            <w:r>
+              <w:rPr>
+                <w:sz w:val="21"/>
+              </w:rPr>
+            </w:r>
+            <w:r>
+              <w:rPr>
+                <w:b w:val="0"/>
+                <w:i w:val="0"/>
+                <w:sz w:val="21"/>
+              </w:rPr>
+              <w:t>Sparebanken Norge, prosjektmidler</w:t>
+            </w:r>
+          </w:p>
+        </w:tc>
+        <w:tc>
+          <w:tcPr>
+            <w:tcW w:type="dxa" w:w="2268"/>
+            <w:shd w:val="clear" w:color="auto" w:fill="F5F9F6"/>
+          </w:tcPr>
+          <w:p>
+            <w:pPr>
+              <w:spacing w:before="60" w:after="60"/>
+            </w:pPr>
+            <w:r>
+              <w:rPr>
+                <w:sz w:val="21"/>
+              </w:rPr>
+            </w:r>
+            <w:r>
+              <w:rPr>
+                <w:b w:val="0"/>
+                <w:i w:val="0"/>
+                <w:sz w:val="21"/>
+              </w:rPr>
+              <w:t>Stord, Os</w:t>
+            </w:r>
+          </w:p>
+        </w:tc>
+        <w:tc>
+          <w:tcPr>
+            <w:tcW w:type="dxa" w:w="2268"/>
+            <w:shd w:val="clear" w:color="auto" w:fill="F5F9F6"/>
+          </w:tcPr>
+          <w:p>
+            <w:pPr>
+              <w:spacing w:before="60" w:after="60"/>
+            </w:pPr>
+            <w:r>
+              <w:rPr>
+                <w:sz w:val="21"/>
+              </w:rPr>
+            </w:r>
+            <w:r>
+              <w:rPr>
+                <w:b w:val="0"/>
+                <w:i w:val="0"/>
+                <w:sz w:val="21"/>
+              </w:rPr>
+              <w:t>Høstvinduet er åpent nå (20.08–01.10). Ingen øvre grense</w:t>
+            </w:r>
+          </w:p>
+        </w:tc>
+      </w:tr>
+      <w:tr>
+        <w:trPr>
+          <w:cantSplit/>
+        </w:trPr>
+        <w:tc>
+          <w:tcPr>
+            <w:tcW w:type="dxa" w:w="2268"/>
+          </w:tcPr>
+          <w:p>
+            <w:pPr>
+              <w:spacing w:before="60" w:after="60"/>
+            </w:pPr>
+            <w:r>
+              <w:rPr>
+                <w:sz w:val="21"/>
+              </w:rPr>
+            </w:r>
+            <w:r>
+              <w:rPr>
+                <w:b/>
+                <w:i w:val="0"/>
+                <w:sz w:val="21"/>
+              </w:rPr>
+              <w:t>20. oktober</w:t>
+            </w:r>
+          </w:p>
+        </w:tc>
+        <w:tc>
+          <w:tcPr>
+            <w:tcW w:type="dxa" w:w="2268"/>
+          </w:tcPr>
+          <w:p>
+            <w:pPr>
+              <w:spacing w:before="60" w:after="60"/>
+            </w:pPr>
+            <w:r>
+              <w:rPr>
+                <w:sz w:val="21"/>
+              </w:rPr>
+            </w:r>
+            <w:r>
+              <w:rPr>
+                <w:b w:val="0"/>
+                <w:i w:val="0"/>
+                <w:sz w:val="21"/>
+              </w:rPr>
+              <w:t>Sparebankstiftelsen SMN</w:t>
+            </w:r>
+          </w:p>
+        </w:tc>
+        <w:tc>
+          <w:tcPr>
+            <w:tcW w:type="dxa" w:w="2268"/>
+          </w:tcPr>
+          <w:p>
+            <w:pPr>
+              <w:spacing w:before="60" w:after="60"/>
+            </w:pPr>
+            <w:r>
+              <w:rPr>
+                <w:sz w:val="21"/>
+              </w:rPr>
+            </w:r>
+            <w:r>
+              <w:rPr>
+                <w:b w:val="0"/>
+                <w:i w:val="0"/>
+                <w:sz w:val="21"/>
+              </w:rPr>
+              <w:t>Trondheim</w:t>
+            </w:r>
+          </w:p>
+        </w:tc>
+        <w:tc>
+          <w:tcPr>
+            <w:tcW w:type="dxa" w:w="2268"/>
+          </w:tcPr>
+          <w:p>
+            <w:pPr>
+              <w:spacing w:before="60" w:after="60"/>
+            </w:pPr>
+            <w:r>
+              <w:rPr>
+                <w:sz w:val="21"/>
+              </w:rPr>
+            </w:r>
+            <w:r>
+              <w:rPr>
+                <w:b w:val="0"/>
+                <w:i w:val="0"/>
+                <w:sz w:val="21"/>
+              </w:rPr>
+              <w:t>Vinduet er åpent (15.09–20.10). Høstens formål er kulturarv — vanskelig passform</w:t>
+            </w:r>
+          </w:p>
+        </w:tc>
+      </w:tr>
+      <w:tr>
+        <w:trPr>
+          <w:cantSplit/>
+        </w:trPr>
+        <w:tc>
+          <w:tcPr>
+            <w:tcW w:type="dxa" w:w="2268"/>
+            <w:shd w:val="clear" w:color="auto" w:fill="F5F9F6"/>
+          </w:tcPr>
+          <w:p>
+            <w:pPr>
+              <w:spacing w:before="60" w:after="60"/>
+            </w:pPr>
+            <w:r>
+              <w:rPr>
+                <w:sz w:val="21"/>
+              </w:rPr>
+            </w:r>
+            <w:r>
+              <w:rPr>
+                <w:b/>
+                <w:i w:val="0"/>
+                <w:sz w:val="21"/>
+              </w:rPr>
+              <w:t>Frist ikke fastsatt</w:t>
             </w:r>
           </w:p>
         </w:tc>
@@ -659,7 +864,23 @@
                 <w:i w:val="0"/>
                 <w:sz w:val="21"/>
               </w:rPr>
-              <w:t>Den største enkeltpotten som passer rekrutteringsarbeid</w:t>
+              <w:t xml:space="preserve">Utlysningen for 2027 publiseres </w:t>
+            </w:r>
+            <w:r>
+              <w:rPr>
+                <w:b/>
+                <w:i w:val="0"/>
+                <w:sz w:val="21"/>
+              </w:rPr>
+              <w:t>midten av oktober 2026</w:t>
+            </w:r>
+            <w:r>
+              <w:rPr>
+                <w:b w:val="0"/>
+                <w:i w:val="0"/>
+                <w:sz w:val="21"/>
+              </w:rPr>
+              <w:t>. Fristen har vært 31.10 / 1.11 tidligere år</w:t>
             </w:r>
           </w:p>
         </w:tc>
@@ -687,7 +908,7 @@
                 <w:i w:val="0"/>
                 <w:sz w:val="21"/>
               </w:rPr>
-              <w:t>15. november</w:t>
+              <w:t>11. november</w:t>
             </w:r>
           </w:p>
         </w:tc>
@@ -756,7 +977,15 @@
                 <w:i w:val="0"/>
                 <w:sz w:val="21"/>
               </w:rPr>
-              <w:t>Fjerde og siste frist i året</w:t>
+              <w:t xml:space="preserve">Siste av fire frister i 2026. Krever støttebehov </w:t>
+            </w:r>
+            <w:r>
+              <w:rPr>
+                <w:b/>
+                <w:i w:val="0"/>
+                <w:sz w:val="21"/>
+              </w:rPr>
+              <w:t>over 300 000 kr</w:t>
             </w:r>
           </w:p>
         </w:tc>
@@ -809,7 +1038,7 @@
                 <w:i w:val="0"/>
                 <w:sz w:val="21"/>
               </w:rPr>
-              <w:t>Idrettsrådets LAM-fordeling</w:t>
+              <w:t>SpareBank 1 Helgeland, Drivkraftstøtte</w:t>
             </w:r>
           </w:p>
         </w:tc>
@@ -833,7 +1062,7 @@
                 <w:i w:val="0"/>
                 <w:sz w:val="21"/>
               </w:rPr>
-              <w:t>Alle</w:t>
+              <w:t>Helgeland</w:t>
             </w:r>
           </w:p>
         </w:tc>
@@ -857,7 +1086,7 @@
                 <w:i w:val="0"/>
                 <w:sz w:val="21"/>
               </w:rPr>
-              <w:t>Avhenger av registrerte medlemmer 6–19 år</w:t>
+              <w:t>Siste av fire frister. Ikke ordinær driftsstøtte</w:t>
             </w:r>
           </w:p>
         </w:tc>
@@ -908,6 +1137,105 @@
                 <w:i w:val="0"/>
                 <w:sz w:val="21"/>
               </w:rPr>
+              <w:t>Sparebanken Norge, ildsjelmidler</w:t>
+            </w:r>
+          </w:p>
+        </w:tc>
+        <w:tc>
+          <w:tcPr>
+            <w:tcW w:type="dxa" w:w="2268"/>
+          </w:tcPr>
+          <w:p>
+            <w:pPr>
+              <w:spacing w:before="60" w:after="60"/>
+            </w:pPr>
+            <w:r>
+              <w:rPr>
+                <w:sz w:val="21"/>
+              </w:rPr>
+            </w:r>
+            <w:r>
+              <w:rPr>
+                <w:b w:val="0"/>
+                <w:i w:val="0"/>
+                <w:sz w:val="21"/>
+              </w:rPr>
+              <w:t>Stord, Os</w:t>
+            </w:r>
+          </w:p>
+        </w:tc>
+        <w:tc>
+          <w:tcPr>
+            <w:tcW w:type="dxa" w:w="2268"/>
+          </w:tcPr>
+          <w:p>
+            <w:pPr>
+              <w:spacing w:before="60" w:after="60"/>
+            </w:pPr>
+            <w:r>
+              <w:rPr>
+                <w:sz w:val="21"/>
+              </w:rPr>
+            </w:r>
+            <w:r>
+              <w:rPr>
+                <w:b w:val="0"/>
+                <w:i w:val="0"/>
+                <w:sz w:val="21"/>
+              </w:rPr>
+              <w:t>Vindu 01.11–01.12. Maks 50 000 kr</w:t>
+            </w:r>
+          </w:p>
+        </w:tc>
+      </w:tr>
+      <w:tr>
+        <w:trPr>
+          <w:cantSplit/>
+        </w:trPr>
+        <w:tc>
+          <w:tcPr>
+            <w:tcW w:type="dxa" w:w="2268"/>
+            <w:shd w:val="clear" w:color="auto" w:fill="F5F9F6"/>
+          </w:tcPr>
+          <w:p>
+            <w:pPr>
+              <w:spacing w:before="60" w:after="60"/>
+            </w:pPr>
+            <w:r>
+              <w:rPr>
+                <w:sz w:val="21"/>
+              </w:rPr>
+            </w:r>
+            <w:r>
+              <w:rPr>
+                <w:b/>
+                <w:i w:val="0"/>
+                <w:sz w:val="21"/>
+              </w:rPr>
+              <w:t>1. desember</w:t>
+            </w:r>
+          </w:p>
+        </w:tc>
+        <w:tc>
+          <w:tcPr>
+            <w:tcW w:type="dxa" w:w="2268"/>
+            <w:shd w:val="clear" w:color="auto" w:fill="F5F9F6"/>
+          </w:tcPr>
+          <w:p>
+            <w:pPr>
+              <w:spacing w:before="60" w:after="60"/>
+            </w:pPr>
+            <w:r>
+              <w:rPr>
+                <w:sz w:val="21"/>
+              </w:rPr>
+            </w:r>
+            <w:r>
+              <w:rPr>
+                <w:b w:val="0"/>
+                <w:i w:val="0"/>
+                <w:sz w:val="21"/>
+              </w:rPr>
               <w:t>Momskompensasjon ved bygging og rehabilitering</w:t>
             </w:r>
           </w:p>
@@ -915,6 +1243,7 @@
         <w:tc>
           <w:tcPr>
             <w:tcW w:type="dxa" w:w="2268"/>
+            <w:shd w:val="clear" w:color="auto" w:fill="F5F9F6"/>
           </w:tcPr>
           <w:p>
             <w:pPr>
@@ -938,6 +1267,7 @@
         <w:tc>
           <w:tcPr>
             <w:tcW w:type="dxa" w:w="2268"/>
+            <w:shd w:val="clear" w:color="auto" w:fill="F5F9F6"/>
           </w:tcPr>
           <w:p>
             <w:pPr>
@@ -955,6 +1285,111 @@
                 <w:sz w:val="21"/>
               </w:rPr>
               <w:t>Lotteri- og stiftelsestilsynet</w:t>
+            </w:r>
+          </w:p>
+        </w:tc>
+      </w:tr>
+      <w:tr>
+        <w:trPr>
+          <w:cantSplit/>
+        </w:trPr>
+        <w:tc>
+          <w:tcPr>
+            <w:tcW w:type="dxa" w:w="2268"/>
+          </w:tcPr>
+          <w:p>
+            <w:pPr>
+              <w:spacing w:before="60" w:after="60"/>
+            </w:pPr>
+            <w:r>
+              <w:rPr>
+                <w:sz w:val="21"/>
+              </w:rPr>
+            </w:r>
+            <w:r>
+              <w:rPr>
+                <w:b/>
+                <w:i w:val="0"/>
+                <w:sz w:val="21"/>
+              </w:rPr>
+              <w:t>Settes lokalt</w:t>
+            </w:r>
+          </w:p>
+        </w:tc>
+        <w:tc>
+          <w:tcPr>
+            <w:tcW w:type="dxa" w:w="2268"/>
+          </w:tcPr>
+          <w:p>
+            <w:pPr>
+              <w:spacing w:before="60" w:after="60"/>
+            </w:pPr>
+            <w:r>
+              <w:rPr>
+                <w:sz w:val="21"/>
+              </w:rPr>
+            </w:r>
+            <w:r>
+              <w:rPr>
+                <w:b w:val="0"/>
+                <w:i w:val="0"/>
+                <w:sz w:val="21"/>
+              </w:rPr>
+              <w:t>Idrettsrådets LAM</w:t>
+            </w:r>
+          </w:p>
+        </w:tc>
+        <w:tc>
+          <w:tcPr>
+            <w:tcW w:type="dxa" w:w="2268"/>
+          </w:tcPr>
+          <w:p>
+            <w:pPr>
+              <w:spacing w:before="60" w:after="60"/>
+            </w:pPr>
+            <w:r>
+              <w:rPr>
+                <w:sz w:val="21"/>
+              </w:rPr>
+            </w:r>
+            <w:r>
+              <w:rPr>
+                <w:b w:val="0"/>
+                <w:i w:val="0"/>
+                <w:sz w:val="21"/>
+              </w:rPr>
+              <w:t>Alle</w:t>
+            </w:r>
+          </w:p>
+        </w:tc>
+        <w:tc>
+          <w:tcPr>
+            <w:tcW w:type="dxa" w:w="2268"/>
+          </w:tcPr>
+          <w:p>
+            <w:pPr>
+              <w:spacing w:before="60" w:after="60"/>
+            </w:pPr>
+            <w:r>
+              <w:rPr>
+                <w:sz w:val="21"/>
+              </w:rPr>
+            </w:r>
+            <w:r>
+              <w:rPr>
+                <w:b/>
+                <w:i w:val="0"/>
+                <w:sz w:val="21"/>
+              </w:rPr>
+              <w:t>Ikke 15. november — det er idrettsrådets frist mot NIF.</w:t>
+            </w:r>
+            <w:r>
+              <w:rPr>
+                <w:b w:val="0"/>
+                <w:i w:val="0"/>
+                <w:sz w:val="21"/>
+              </w:rPr>
+              <w:t xml:space="preserve"> Klubbens frist settes av idrettsrådet, ofte august–september</w:t>
             </w:r>
           </w:p>
         </w:tc>
@@ -1980,14 +2415,14 @@
           <w:b/>
           <w:i w:val="0"/>
         </w:rPr>
-        <w:t>Gjensidigestiftelsens vårfrist — sommerutlysningen</w:t>
+        <w:t>Gjensidigestiftelsens vårfrist — sommerutlysningen, 1. mars</w:t>
       </w:r>
       <w:r>
         <w:rPr>
           <w:b w:val="0"/>
           <w:i w:val="0"/>
         </w:rPr>
-        <w:t xml:space="preserve"> (2026: 2. mars). Retter seg mot sommeraktiviteter og sommerjobber for barn og unge. Egen utlysning med egne kriterier, ikke samme pott som høstfristen.</w:t>
+        <w:t xml:space="preserve"> (justeres til nærmeste virkedag; i 2026 var den 2. mars). Retter seg mot sommeraktiviteter og sommerjobber for barn og unge. Egen utlysning med egne kriterier, ikke samme pott som høstfristen.</w:t>
       </w:r>
     </w:p>
     <w:p>
@@ -2231,7 +2666,21 @@
           <w:b w:val="0"/>
           <w:i w:val="0"/>
         </w:rPr>
-        <w:t xml:space="preserve"> Verifisert for 2026. Prosjektet må starte året etter — søker du i 2026, skal tiltaket settes i gang i 2027.</w:t>
+        <w:t xml:space="preserve"> Kontrollert 14.09.2026 — fristen for 2026 er passert. </w:t>
+      </w:r>
+      <w:r>
+        <w:rPr>
+          <w:b/>
+          <w:i w:val="0"/>
+        </w:rPr>
+        <w:t>Første mulige oppstart er 1. desember i søknadsåret</w:t>
+      </w:r>
+      <w:r>
+        <w:rPr>
+          <w:b w:val="0"/>
+          <w:i w:val="0"/>
+        </w:rPr>
+        <w:t>, ikke året etter.</w:t>
       </w:r>
     </w:p>
     <w:p>
@@ -2300,14 +2749,28 @@
           <w:b/>
           <w:i w:val="0"/>
         </w:rPr>
-        <w:t>Frist Bufdir «Tilskudd til inkludering av barn og unge»</w:t>
+        <w:t>Bufdir «Tilskudd til inkludering av barn og unge».</w:t>
       </w:r>
       <w:r>
         <w:rPr>
           <w:b w:val="0"/>
           <w:i w:val="0"/>
         </w:rPr>
-        <w:t xml:space="preserve"> — de siste årene 31. oktober / 1. november. Dette er den største enkeltpotten som er relevant for rekrutteringsarbeid.</w:t>
+        <w:t xml:space="preserve"> Bufdir opplyser selv at </w:t>
+      </w:r>
+      <w:r>
+        <w:rPr>
+          <w:b/>
+          <w:i w:val="0"/>
+        </w:rPr>
+        <w:t>utlysningen for 2027 publiseres midten av oktober 2026</w:t>
+      </w:r>
+      <w:r>
+        <w:rPr>
+          <w:b w:val="0"/>
+          <w:i w:val="0"/>
+        </w:rPr>
+        <w:t xml:space="preserve"> — fristen er altså ikke kjent når dette skrives. Tidligere år: 31. oktober / 1. november. Dette er den største enkeltpotten som er relevant for rekrutteringsarbeid.</w:t>
       </w:r>
     </w:p>
     <w:p>
@@ -2333,14 +2796,28 @@
           <w:b/>
           <w:i w:val="0"/>
         </w:rPr>
-        <w:t>15. november: idrettsrådets LAM-fordeling må være innsendt.</w:t>
+        <w:t>15. november: idrettsrådets LAM-fordeling må være innsendt til NIF.</w:t>
       </w:r>
       <w:r>
         <w:rPr>
           <w:b w:val="0"/>
           <w:i w:val="0"/>
         </w:rPr>
-        <w:t xml:space="preserve"> Ikke klubbens frist, men følg opp at dere er med.</w:t>
+        <w:t xml:space="preserve"> Dette er </w:t>
+      </w:r>
+      <w:r>
+        <w:rPr>
+          <w:b w:val="0"/>
+          <w:i/>
+        </w:rPr>
+        <w:t>idrettsrådets</w:t>
+      </w:r>
+      <w:r>
+        <w:rPr>
+          <w:b w:val="0"/>
+          <w:i w:val="0"/>
+        </w:rPr>
+        <w:t xml:space="preserve"> frist, ikke klubbens. Har idrettsrådet deres egen søknadsordning, gikk klubbens frist trolig i august eller september — spør dem i juni.</w:t>
       </w:r>
     </w:p>
     <w:p>
@@ -2476,7 +2953,21 @@
           <w:b w:val="0"/>
           <w:i w:val="0"/>
         </w:rPr>
-        <w:t xml:space="preserve"> 15. august (for NIF-tilsluttede klubber)</w:t>
+        <w:t xml:space="preserve"> 15. august for NIF-tilsluttede klubber — samme dato i 2022, 2024, 2025 og 2026. Fristen for 2027 er ikke publisert. Organisasjoner </w:t>
+      </w:r>
+      <w:r>
+        <w:rPr>
+          <w:b/>
+          <w:i w:val="0"/>
+        </w:rPr>
+        <w:t>uten</w:t>
+      </w:r>
+      <w:r>
+        <w:rPr>
+          <w:b w:val="0"/>
+          <w:i w:val="0"/>
+        </w:rPr>
+        <w:t xml:space="preserve"> sentralledd søker Lotteri- og stiftelsestilsynet direkte, med frist 1. september</w:t>
       </w:r>
     </w:p>
     <w:p>
@@ -2514,7 +3005,7 @@
           <w:b w:val="0"/>
           <w:i w:val="0"/>
         </w:rPr>
-        <w:t xml:space="preserve"> NIFs forvaltningsportal, innlogging via MinIdrett. Kun daglig leder og styremedlemmer kan søke.</w:t>
+        <w:t xml:space="preserve"> NIFs forvaltningsportal, innlogging via MinIdrett. Kun daglig leder og styremedlemmer kan søke. Fra 2026 skal alle idrettslag søke gjennom NIFs nye forvaltningsportal</w:t>
       </w:r>
     </w:p>
     <w:p>
@@ -2604,7 +3095,35 @@
           <w:b w:val="0"/>
           <w:i w:val="0"/>
         </w:rPr>
-        <w:t xml:space="preserve"> Ingen søknadsfrist i de fleste kommuner — fordeles automatisk etter medlemstall</w:t>
+        <w:t xml:space="preserve"> </w:t>
+      </w:r>
+      <w:r>
+        <w:rPr>
+          <w:b/>
+          <w:i w:val="0"/>
+        </w:rPr>
+        <w:t>Varierer — sjekk ditt eget idrettsråd.</w:t>
+      </w:r>
+      <w:r>
+        <w:rPr>
+          <w:b w:val="0"/>
+          <w:i w:val="0"/>
+        </w:rPr>
+        <w:t xml:space="preserve"> NIF </w:t>
+      </w:r>
+      <w:r>
+        <w:rPr>
+          <w:b w:val="0"/>
+          <w:i/>
+        </w:rPr>
+        <w:t>anbefaler</w:t>
+      </w:r>
+      <w:r>
+        <w:rPr>
+          <w:b w:val="0"/>
+          <w:i w:val="0"/>
+        </w:rPr>
+        <w:t xml:space="preserve"> at idrettsrådene ikke bruker søknadsordning, men mange gjør det likevel (Drammen hadde 3. august 2026, Lørenskog 1. september). Idrettsrådets egen frist mot NIF er 15. november, men det er ikke klubbens frist</w:t>
       </w:r>
     </w:p>
     <w:p>
@@ -2681,6 +3200,25 @@
           <w:i w:val="0"/>
         </w:rPr>
         <w:t xml:space="preserve"> Delta på idrettsrådets årsmøte. Kriteriene settes der.</w:t>
+      </w:r>
+    </w:p>
+    <w:p>
+      <w:pPr>
+        <w:pStyle w:val="ListBullet"/>
+      </w:pPr>
+      <w:r>
+        <w:rPr>
+          <w:b/>
+          <w:i w:val="0"/>
+        </w:rPr>
+        <w:t>Gjør dette i juni:</w:t>
+      </w:r>
+      <w:r>
+        <w:rPr>
+          <w:b w:val="0"/>
+          <w:i w:val="0"/>
+        </w:rPr>
+        <w:t xml:space="preserve"> ring idrettsrådet og spør om de har søknadsordning, og hva fristen er. Det finnes ingen nasjonal oversikt — det må gjøres per kommune</w:t>
       </w:r>
     </w:p>
     <w:p>
@@ -2902,7 +3440,7 @@
           <w:b w:val="0"/>
           <w:i/>
         </w:rPr>
-        <w:t xml:space="preserve">Verifisert mot stiftelsens egne sider 2026-08-11. Detaljer og sitater i </w:t>
+        <w:t xml:space="preserve">Kontrollert mot stiftelsens egne sider 14.09.2026. Detaljer og sitater i </w:t>
       </w:r>
       <w:r>
         <w:rPr>
@@ -2943,7 +3481,7 @@
           <w:b/>
           <w:i w:val="0"/>
         </w:rPr>
-        <w:t>Sommerutlysningen 1.–2. mars</w:t>
+        <w:t>Sommerutlysningen 1. mars</w:t>
       </w:r>
       <w:r>
         <w:rPr>
@@ -2964,14 +3502,14 @@
           <w:b w:val="0"/>
           <w:i w:val="0"/>
         </w:rPr>
-        <w:t xml:space="preserve">. For 2026: </w:t>
+        <w:t xml:space="preserve"> — begge justeres til nærmeste virkedag. 2026-fristene er passert. </w:t>
       </w:r>
       <w:r>
         <w:rPr>
           <w:b/>
           <w:i w:val="0"/>
         </w:rPr>
-        <w:t>1. september kl. 16:00</w:t>
+        <w:t>Ingen 2027-utlysning er publisert per 14.09.2026</w:t>
       </w:r>
     </w:p>
     <w:p>
@@ -3021,14 +3559,28 @@
           <w:b/>
           <w:i w:val="0"/>
         </w:rPr>
-        <w:t>Beløp: minimum 30 000 kr, maksimum 800 000 kr.</w:t>
+        <w:t>Beløp: minimum 30 000 kr.</w:t>
       </w:r>
       <w:r>
         <w:rPr>
           <w:b w:val="0"/>
           <w:i w:val="0"/>
         </w:rPr>
-        <w:t xml:space="preserve"> Varighet inntil 3 år</w:t>
+        <w:t xml:space="preserve"> Maksbeløpet er </w:t>
+      </w:r>
+      <w:r>
+        <w:rPr>
+          <w:b/>
+          <w:i w:val="0"/>
+        </w:rPr>
+        <w:t>utlysningsspesifikt</w:t>
+      </w:r>
+      <w:r>
+        <w:rPr>
+          <w:b w:val="0"/>
+          <w:i w:val="0"/>
+        </w:rPr>
+        <w:t xml:space="preserve"> — høstutlysningen 2026 hadde tak på 800 000 kr med varighet inntil 3 år, mens sommerutlysningen samme år hadde tak på 300 000 kr. Ikke regn med 800 000 før utlysningen sier det</w:t>
       </w:r>
     </w:p>
     <w:p>
@@ -3040,14 +3592,28 @@
           <w:b/>
           <w:i w:val="0"/>
         </w:rPr>
-        <w:t>Prosjektet må starte i 2027.</w:t>
+        <w:t>Oppstart: tidligst 1. desember i søknadsåret.</w:t>
       </w:r>
       <w:r>
         <w:rPr>
           <w:b w:val="0"/>
           <w:i w:val="0"/>
         </w:rPr>
-        <w:t xml:space="preserve"> «Allerede igangsatte prosjekter støttes ikke»</w:t>
+        <w:t xml:space="preserve"> Stiftelsen skriver: «Søker du på denne utlysningen, er første mulige startdato 1. desember samme år.» Prosjektperioden for 2026-utlysningen var desember 2026 – desember 2029. </w:t>
+      </w:r>
+      <w:r>
+        <w:rPr>
+          <w:b/>
+          <w:i w:val="0"/>
+        </w:rPr>
+        <w:t>Rettet 14.09.2026:</w:t>
+      </w:r>
+      <w:r>
+        <w:rPr>
+          <w:b w:val="0"/>
+          <w:i w:val="0"/>
+        </w:rPr>
+        <w:t xml:space="preserve"> dokumentet sa tidligere at prosjektet måtte starte året etter. Det var feil</w:t>
       </w:r>
     </w:p>
     <w:p>
@@ -3059,14 +3625,47 @@
           <w:b/>
           <w:i w:val="0"/>
         </w:rPr>
-        <w:t>Hva støttes IKKE:</w:t>
+        <w:t>Hva støttes IKKE</w:t>
       </w:r>
       <w:r>
         <w:rPr>
           <w:b w:val="0"/>
           <w:i w:val="0"/>
         </w:rPr>
-        <w:t xml:space="preserve"> faste kostnader (administrasjon, husleie, strøm), bygging og oppussing, parti-/interessepolitiske og religiøse formål, aktiviteter i utlandet. Søknader som kun gjelder utstyrsinnkjøp får avslag</w:t>
+        <w:t xml:space="preserve"> (høstutlysningen 2026, ordrett fire punkter): organisasjonens faste kostnader som administrasjon, husleie og strøm; bygging, tilrettelegging eller oppussing av anlegg, uteområder eller lokaler; parti- eller interessepolitiske formål og religiøs påvirkning; aktiviteter som foregår i utlandet</w:t>
+      </w:r>
+    </w:p>
+    <w:p>
+      <w:pPr>
+        <w:pStyle w:val="ListBullet"/>
+      </w:pPr>
+      <w:r>
+        <w:rPr>
+          <w:b/>
+          <w:i w:val="0"/>
+        </w:rPr>
+        <w:t>Utstyr er støtteberettiget.</w:t>
+      </w:r>
+      <w:r>
+        <w:rPr>
+          <w:b w:val="0"/>
+          <w:i w:val="0"/>
+        </w:rPr>
+        <w:t xml:space="preserve"> Samme utlysning fører «utstyr og inventar» opp som godkjent kostnad. </w:t>
+      </w:r>
+      <w:r>
+        <w:rPr>
+          <w:b/>
+          <w:i w:val="0"/>
+        </w:rPr>
+        <w:t>Rettet 14.09.2026:</w:t>
+      </w:r>
+      <w:r>
+        <w:rPr>
+          <w:b w:val="0"/>
+          <w:i w:val="0"/>
+        </w:rPr>
+        <w:t xml:space="preserve"> dokumentet sa tidligere at søknader som kun gjelder utstyrsinnkjøp får avslag. Den regelen sto på et kvalifiseringsskjema og gjaldt 2025</w:t>
       </w:r>
     </w:p>
     <w:p>
@@ -3581,7 +4180,21 @@
           <w:b w:val="0"/>
           <w:i w:val="0"/>
         </w:rPr>
-        <w:t xml:space="preserve"> Utlysning i september/oktober, søknadsfrist normalt 31. oktober / 1. november</w:t>
+        <w:t xml:space="preserve"> </w:t>
+      </w:r>
+      <w:r>
+        <w:rPr>
+          <w:b/>
+          <w:i w:val="0"/>
+        </w:rPr>
+        <w:t>Ikke fastsatt for 2027.</w:t>
+      </w:r>
+      <w:r>
+        <w:rPr>
+          <w:b w:val="0"/>
+          <w:i w:val="0"/>
+        </w:rPr>
+        <w:t xml:space="preserve"> Bufdir skriver selv: «Informasjon om utlysning for 2027 publiseres i midten av oktober 2026.» Til sammenligning hadde 2025-runden frist 1. november 2024. Sett av tid i midten av oktober til å lese utlysningen når den kommer</w:t>
       </w:r>
     </w:p>
     <w:p>
@@ -3676,7 +4289,21 @@
           <w:b w:val="0"/>
           <w:i w:val="0"/>
         </w:rPr>
-        <w:t xml:space="preserve"> Ordningen er under omlegging fra 2027. Kommuner flyttes til et nytt program, men frivillige organisasjoner kan fortsatt søke. Følg med på utlysningen.</w:t>
+        <w:t xml:space="preserve"> Ordningen legges om. Fra 2027 flyttes midlene til «Kommunalt forebyggingsprogram for barn og unge», og </w:t>
+      </w:r>
+      <w:r>
+        <w:rPr>
+          <w:b/>
+          <w:i w:val="0"/>
+        </w:rPr>
+        <w:t>kommuner kan ikke lenger søke denne ordningen</w:t>
+      </w:r>
+      <w:r>
+        <w:rPr>
+          <w:b w:val="0"/>
+          <w:i w:val="0"/>
+        </w:rPr>
+        <w:t>. Frivillige organisasjoner kan fortsatt søke, men de fleste av de tolv aktivitetstypene krever at søknaden knyttes til en deltakende kommune — og Bufdir «vektlegger i stor grad kommunens rangering». Les utlysningen når den kommer før dere regner med noe</w:t>
       </w:r>
     </w:p>
     <w:p>
@@ -3729,7 +4356,7 @@
           <w:color w:val="2F6B45"/>
           <w:sz w:val="22"/>
         </w:rPr>
-        <w:t>Verifisert 2026-08-11</w:t>
+        <w:t>Kontrollert 14.09.2026</w:t>
       </w:r>
     </w:p>
     <w:p>
@@ -3936,14 +4563,28 @@
           <w:b/>
           <w:i w:val="0"/>
         </w:rPr>
-        <w:t>Neste frist: 15. september 2026, innen kl. 16:00.</w:t>
+        <w:t>Frist 15. september 2026 kl. 16:00 — passert.</w:t>
       </w:r>
       <w:r>
         <w:rPr>
           <w:b w:val="0"/>
           <w:i w:val="0"/>
         </w:rPr>
-        <w:t xml:space="preserve"> Søknadsskjemaet åpner den 15. august. To behandlingsrunder i året</w:t>
+        <w:t xml:space="preserve"> Søknadsskjemaet åpner </w:t>
+      </w:r>
+      <w:r>
+        <w:rPr>
+          <w:b/>
+          <w:i w:val="0"/>
+        </w:rPr>
+        <w:t>en måned før frist</w:t>
+      </w:r>
+      <w:r>
+        <w:rPr>
+          <w:b w:val="0"/>
+          <w:i w:val="0"/>
+        </w:rPr>
+        <w:t xml:space="preserve"> (stiftelsens egen formulering; datoen 15. august sto ikke noe sted og er strøket). To behandlingsrunder i året, styret behandler ca. tre måneder etter frist. Vårfristen 2027 er ikke publisert</w:t>
       </w:r>
     </w:p>
     <w:p>
@@ -4102,7 +4743,7 @@
           <w:color w:val="2F6B45"/>
           <w:sz w:val="22"/>
         </w:rPr>
-        <w:t>Verifisert 2026-08-11 — hvilken ordning gjelder hvilken klubb</w:t>
+        <w:t>Kontrollert 14.09.2026 — hvilken ordning gjelder hvilken klubb</w:t>
       </w:r>
     </w:p>
     <w:tbl>
@@ -4275,7 +4916,7 @@
                 <w:i w:val="0"/>
                 <w:sz w:val="21"/>
               </w:rPr>
-              <w:t>Verifisert</w:t>
+              <w:t>Kontrollert 14.09.2026 — alt stemte.</w:t>
             </w:r>
             <w:r>
               <w:rPr>
@@ -4283,7 +4924,7 @@
                 <w:i w:val="0"/>
                 <w:sz w:val="21"/>
               </w:rPr>
-              <w:t xml:space="preserve"> — østlandsområdet</w:t>
+              <w:t xml:space="preserve"> Over 50 000 kr: frist 1.2. og 1.9. kl. 23:59. Inntil 50 000 kr: løpende, men ikke 21.11–31.12</w:t>
             </w:r>
           </w:p>
         </w:tc>
@@ -4360,7 +5001,7 @@
                 <w:i w:val="0"/>
                 <w:sz w:val="21"/>
               </w:rPr>
-              <w:t>Verifisert</w:t>
+              <w:t>Kontrollert 14.09.2026 — alt stemte.</w:t>
             </w:r>
             <w:r>
               <w:rPr>
@@ -4368,7 +5009,7 @@
                 <w:i w:val="0"/>
                 <w:sz w:val="21"/>
               </w:rPr>
-              <w:t xml:space="preserve"> — østlandsområdet</w:t>
+              <w:t xml:space="preserve"> Samme frister som Oslo. Området er Oslo, Viken, Vestfold, Telemark, tidligere Oppland og Ringsaker</w:t>
             </w:r>
           </w:p>
         </w:tc>
@@ -4427,7 +5068,23 @@
                 <w:i w:val="0"/>
                 <w:sz w:val="21"/>
               </w:rPr>
-              <w:t xml:space="preserve"> — prosjektmidler og ildsjelmidler</w:t>
+              <w:t xml:space="preserve"> — prosjektmidler </w:t>
+            </w:r>
+            <w:r>
+              <w:rPr>
+                <w:b w:val="0"/>
+                <w:i/>
+                <w:sz w:val="21"/>
+              </w:rPr>
+              <w:t>og</w:t>
+            </w:r>
+            <w:r>
+              <w:rPr>
+                <w:b w:val="0"/>
+                <w:i w:val="0"/>
+                <w:sz w:val="21"/>
+              </w:rPr>
+              <w:t xml:space="preserve"> ildsjelmidler, to ulike ordninger</w:t>
             </w:r>
           </w:p>
         </w:tc>
@@ -4450,7 +5107,7 @@
                 <w:i w:val="0"/>
                 <w:sz w:val="21"/>
               </w:rPr>
-              <w:t>Verifisert.</w:t>
+              <w:t>Kontrollert 14.09.2026.</w:t>
             </w:r>
             <w:r>
               <w:rPr>
@@ -4458,7 +5115,39 @@
                 <w:i w:val="0"/>
                 <w:sz w:val="21"/>
               </w:rPr>
-              <w:t xml:space="preserve"> Banken har kontor i Leirvik. Vindu 20.02–15.04 og 20.08–01.10</w:t>
+              <w:t xml:space="preserve"> Kontor i Leirvik. </w:t>
+            </w:r>
+            <w:r>
+              <w:rPr>
+                <w:b/>
+                <w:i w:val="0"/>
+                <w:sz w:val="21"/>
+              </w:rPr>
+              <w:t>Prosjektmidler:</w:t>
+            </w:r>
+            <w:r>
+              <w:rPr>
+                <w:b w:val="0"/>
+                <w:i w:val="0"/>
+                <w:sz w:val="21"/>
+              </w:rPr>
+              <w:t xml:space="preserve"> vindu 20.02–15.04 og 20.08–01.10, ingen øvre grense. </w:t>
+            </w:r>
+            <w:r>
+              <w:rPr>
+                <w:b/>
+                <w:i w:val="0"/>
+                <w:sz w:val="21"/>
+              </w:rPr>
+              <w:t>Ildsjelmidler:</w:t>
+            </w:r>
+            <w:r>
+              <w:rPr>
+                <w:b w:val="0"/>
+                <w:i w:val="0"/>
+                <w:sz w:val="21"/>
+              </w:rPr>
+              <w:t xml:space="preserve"> vindu 01.06–01.07 og 01.11–01.12, maks 50 000 kr</w:t>
             </w:r>
           </w:p>
         </w:tc>
@@ -4519,7 +5208,7 @@
                 <w:i w:val="0"/>
                 <w:sz w:val="21"/>
               </w:rPr>
-              <w:t xml:space="preserve"> — prosjektmidler og ildsjelmidler</w:t>
+              <w:t xml:space="preserve"> — samme to ordninger</w:t>
             </w:r>
           </w:p>
         </w:tc>
@@ -4543,7 +5232,7 @@
                 <w:i w:val="0"/>
                 <w:sz w:val="21"/>
               </w:rPr>
-              <w:t>Verifisert.</w:t>
+              <w:t>Kontrollert 14.09.2026.</w:t>
             </w:r>
             <w:r>
               <w:rPr>
@@ -4551,7 +5240,7 @@
                 <w:i w:val="0"/>
                 <w:sz w:val="21"/>
               </w:rPr>
-              <w:t xml:space="preserve"> Banken har kontor på Osøyro. Samme to vinduer</w:t>
+              <w:t xml:space="preserve"> Kontor på Osøyro, Torggata 14. Samme vinduer og grenser som Stord</w:t>
             </w:r>
           </w:p>
         </w:tc>
@@ -4633,7 +5322,7 @@
                 <w:i w:val="0"/>
                 <w:sz w:val="21"/>
               </w:rPr>
-              <w:t>Verifisert.</w:t>
+              <w:t>Kontrollert 14.09.2026.</w:t>
             </w:r>
             <w:r>
               <w:rPr>
@@ -4641,7 +5330,23 @@
                 <w:i w:val="0"/>
                 <w:sz w:val="21"/>
               </w:rPr>
-              <w:t xml:space="preserve"> Banken har løpende frist, ca. 30 dagers svar. Stiftelsen lyser ut halvårlig</w:t>
+              <w:t xml:space="preserve"> Banken: løpende frist, ca. 30 dagers svar, normalt </w:t>
+            </w:r>
+            <w:r>
+              <w:rPr>
+                <w:b/>
+                <w:i w:val="0"/>
+                <w:sz w:val="21"/>
+              </w:rPr>
+              <w:t>inntil 25 000 kr</w:t>
+            </w:r>
+            <w:r>
+              <w:rPr>
+                <w:b w:val="0"/>
+                <w:i w:val="0"/>
+                <w:sz w:val="21"/>
+              </w:rPr>
+              <w:t xml:space="preserve"> og maks 50 % av kostnadene. Stiftelsen: halvårlig, vindu 15.09–20.10.2026, formål «kulturarv»</w:t>
             </w:r>
           </w:p>
         </w:tc>
@@ -4718,7 +5423,7 @@
                 <w:i w:val="0"/>
                 <w:sz w:val="21"/>
               </w:rPr>
-              <w:t>Verifisert.</w:t>
+              <w:t>Rettet 14.09.2026: to utlysninger i året, ikke tre.</w:t>
             </w:r>
             <w:r>
               <w:rPr>
@@ -4726,7 +5431,23 @@
                 <w:i w:val="0"/>
                 <w:sz w:val="21"/>
               </w:rPr>
-              <w:t xml:space="preserve"> Tre utlysninger med frist 1. oktober</w:t>
+              <w:t xml:space="preserve"> Banken skriver «I 2026 vil det være én frist på våren og én på høsten». Høstfrist </w:t>
+            </w:r>
+            <w:r>
+              <w:rPr>
+                <w:b/>
+                <w:i w:val="0"/>
+                <w:sz w:val="21"/>
+              </w:rPr>
+              <w:t>1. oktober 2026</w:t>
+            </w:r>
+            <w:r>
+              <w:rPr>
+                <w:b w:val="0"/>
+                <w:i w:val="0"/>
+                <w:sz w:val="21"/>
+              </w:rPr>
+              <w:t>. Snitt ca. 65 000 kr, maks 50 % av budsjettet</w:t>
             </w:r>
           </w:p>
         </w:tc>
@@ -4754,30 +5475,15 @@
                 <w:i w:val="0"/>
                 <w:sz w:val="21"/>
               </w:rPr>
-              <w:t>Helgeland Snooker</w:t>
-            </w:r>
-          </w:p>
-        </w:tc>
-        <w:tc>
-          <w:tcPr>
-            <w:tcW w:type="dxa" w:w="3024"/>
-          </w:tcPr>
-          <w:p>
-            <w:pPr>
-              <w:spacing w:before="60" w:after="60"/>
-            </w:pPr>
-            <w:r>
-              <w:rPr>
-                <w:sz w:val="21"/>
-              </w:rPr>
+              <w:t xml:space="preserve">Helgeland Snooker — </w:t>
             </w:r>
             <w:r>
               <w:rPr>
-                <w:b w:val="0"/>
+                <w:b/>
                 <w:i w:val="0"/>
                 <w:sz w:val="21"/>
               </w:rPr>
-              <w:t>SpareBank 1 Helgeland Drivkraftstøtte, Sparebankstiftelsen Helgeland</w:t>
+              <w:t>banken</w:t>
             </w:r>
           </w:p>
         </w:tc>
@@ -4800,7 +5506,30 @@
                 <w:i w:val="0"/>
                 <w:sz w:val="21"/>
               </w:rPr>
-              <w:t>Verifisert.</w:t>
+              <w:t>SpareBank 1 Helgeland, Drivkraftstøtte</w:t>
+            </w:r>
+          </w:p>
+        </w:tc>
+        <w:tc>
+          <w:tcPr>
+            <w:tcW w:type="dxa" w:w="3024"/>
+          </w:tcPr>
+          <w:p>
+            <w:pPr>
+              <w:spacing w:before="60" w:after="60"/>
+            </w:pPr>
+            <w:r>
+              <w:rPr>
+                <w:sz w:val="21"/>
+              </w:rPr>
+            </w:r>
+            <w:r>
+              <w:rPr>
+                <w:b/>
+                <w:i w:val="0"/>
+                <w:sz w:val="21"/>
+              </w:rPr>
+              <w:t>Kontrollert 14.09.2026.</w:t>
             </w:r>
             <w:r>
               <w:rPr>
@@ -4808,7 +5537,148 @@
                 <w:i w:val="0"/>
                 <w:sz w:val="21"/>
               </w:rPr>
-              <w:t xml:space="preserve"> Fire frister i året: 15.03, 15.05, 15.08, 15.11</w:t>
+              <w:t xml:space="preserve"> Fire frister: </w:t>
+            </w:r>
+            <w:r>
+              <w:rPr>
+                <w:b/>
+                <w:i w:val="0"/>
+                <w:sz w:val="21"/>
+              </w:rPr>
+              <w:t>15.03, 15.05, 15.08, 15.11.</w:t>
+            </w:r>
+            <w:r>
+              <w:rPr>
+                <w:b w:val="0"/>
+                <w:i w:val="0"/>
+                <w:sz w:val="21"/>
+              </w:rPr>
+              <w:t xml:space="preserve"> Søknad kan sendes når som helst, men behandles ved neste frist. Ikke ordinær driftsstøtte, ikke reiser</w:t>
+            </w:r>
+          </w:p>
+        </w:tc>
+      </w:tr>
+      <w:tr>
+        <w:trPr>
+          <w:cantSplit/>
+        </w:trPr>
+        <w:tc>
+          <w:tcPr>
+            <w:tcW w:type="dxa" w:w="3024"/>
+            <w:shd w:val="clear" w:color="auto" w:fill="F5F9F6"/>
+          </w:tcPr>
+          <w:p>
+            <w:pPr>
+              <w:spacing w:before="60" w:after="60"/>
+            </w:pPr>
+            <w:r>
+              <w:rPr>
+                <w:sz w:val="21"/>
+              </w:rPr>
+            </w:r>
+            <w:r>
+              <w:rPr>
+                <w:b w:val="0"/>
+                <w:i w:val="0"/>
+                <w:sz w:val="21"/>
+              </w:rPr>
+              <w:t xml:space="preserve">Helgeland Snooker — </w:t>
+            </w:r>
+            <w:r>
+              <w:rPr>
+                <w:b/>
+                <w:i w:val="0"/>
+                <w:sz w:val="21"/>
+              </w:rPr>
+              <w:t>stiftelsen</w:t>
+            </w:r>
+          </w:p>
+        </w:tc>
+        <w:tc>
+          <w:tcPr>
+            <w:tcW w:type="dxa" w:w="3024"/>
+            <w:shd w:val="clear" w:color="auto" w:fill="F5F9F6"/>
+          </w:tcPr>
+          <w:p>
+            <w:pPr>
+              <w:spacing w:before="60" w:after="60"/>
+            </w:pPr>
+            <w:r>
+              <w:rPr>
+                <w:sz w:val="21"/>
+              </w:rPr>
+            </w:r>
+            <w:r>
+              <w:rPr>
+                <w:b/>
+                <w:i w:val="0"/>
+                <w:sz w:val="21"/>
+              </w:rPr>
+              <w:t>Sparebankstiftelsen Helgeland</w:t>
+            </w:r>
+          </w:p>
+        </w:tc>
+        <w:tc>
+          <w:tcPr>
+            <w:tcW w:type="dxa" w:w="3024"/>
+            <w:shd w:val="clear" w:color="auto" w:fill="F5F9F6"/>
+          </w:tcPr>
+          <w:p>
+            <w:pPr>
+              <w:spacing w:before="60" w:after="60"/>
+            </w:pPr>
+            <w:r>
+              <w:rPr>
+                <w:sz w:val="21"/>
+              </w:rPr>
+            </w:r>
+            <w:r>
+              <w:rPr>
+                <w:b/>
+                <w:i w:val="0"/>
+                <w:sz w:val="21"/>
+              </w:rPr>
+              <w:t>Rettet 14.09.2026 — datoene var bankens, ikke stiftelsens.</w:t>
+            </w:r>
+            <w:r>
+              <w:rPr>
+                <w:b w:val="0"/>
+                <w:i w:val="0"/>
+                <w:sz w:val="21"/>
+              </w:rPr>
+              <w:t xml:space="preserve"> Stiftelsens frister 2026: </w:t>
+            </w:r>
+            <w:r>
+              <w:rPr>
+                <w:b/>
+                <w:i w:val="0"/>
+                <w:sz w:val="21"/>
+              </w:rPr>
+              <w:t>21.02, 27.05, 02.09, 11.11.</w:t>
+            </w:r>
+            <w:r>
+              <w:rPr>
+                <w:b w:val="0"/>
+                <w:i w:val="0"/>
+                <w:sz w:val="21"/>
+              </w:rPr>
+              <w:t xml:space="preserve"> Krever støttebehov </w:t>
+            </w:r>
+            <w:r>
+              <w:rPr>
+                <w:b/>
+                <w:i w:val="0"/>
+                <w:sz w:val="21"/>
+              </w:rPr>
+              <w:t>over 300 000 kr</w:t>
+            </w:r>
+            <w:r>
+              <w:rPr>
+                <w:b w:val="0"/>
+                <w:i w:val="0"/>
+                <w:sz w:val="21"/>
+              </w:rPr>
+              <w:t>. Støtter ikke drift, reiser eller arrangementer</w:t>
             </w:r>
           </w:p>
         </w:tc>
@@ -5101,21 +5971,21 @@
           <w:b w:val="0"/>
           <w:i w:val="0"/>
         </w:rPr>
-        <w:t xml:space="preserve">Bestem om klubben søker Gjensidigestiftelsen innen </w:t>
+        <w:t xml:space="preserve">Gjensidigestiftelsens 2026-frister er passert. Neste runde ventes ca. 1. mars 2027, men </w:t>
       </w:r>
       <w:r>
         <w:rPr>
           <w:b/>
           <w:i w:val="0"/>
         </w:rPr>
-        <w:t>1. september kl. 16:00</w:t>
+        <w:t>er ikke publisert</w:t>
       </w:r>
       <w:r>
         <w:rPr>
           <w:b w:val="0"/>
           <w:i w:val="0"/>
         </w:rPr>
-        <w:t>. Søknaden gjelder et tiltak som starter i 2027.</w:t>
+        <w:t>. Sett en påminnelse i februar.</w:t>
       </w:r>
     </w:p>
     <w:p>
@@ -5131,7 +6001,21 @@
           <w:b w:val="0"/>
           <w:i w:val="0"/>
         </w:rPr>
-        <w:t>Finn kommunens kontaktperson for Bufdir-ordningen og send en e-post om at klubben vurderer å søke.</w:t>
+        <w:t xml:space="preserve">Finn kommunens kontaktperson for Bufdir-ordningen og send en e-post om at klubben vurderer å søke. </w:t>
+      </w:r>
+      <w:r>
+        <w:rPr>
+          <w:b/>
+          <w:i w:val="0"/>
+        </w:rPr>
+        <w:t>Gjør dette før utlysningen kommer midt i oktober</w:t>
+      </w:r>
+      <w:r>
+        <w:rPr>
+          <w:b w:val="0"/>
+          <w:i w:val="0"/>
+        </w:rPr>
+        <w:t xml:space="preserve"> — kommunen rangerer søknadene, og de som har tatt kontakt på forhånd rangeres høyere.</w:t>
       </w:r>
     </w:p>
     <w:p>
@@ -5189,17 +6073,809 @@
           <w:color w:val="1F7A4D"/>
           <w:sz w:val="28"/>
         </w:rPr>
-        <w:t>Om tallene og fristene</w:t>
+        <w:t>Hva som er kontrollert, og hva som ikke er det</w:t>
       </w:r>
       <w:bookmarkEnd w:id="1006"/>
     </w:p>
     <w:p>
       <w:r>
         <w:rPr>
+          <w:b/>
+          <w:i w:val="0"/>
+        </w:rPr>
+        <w:t>14. september 2026 ble alle ordninger som sto merket «Verifisert» kontrollert mot kildenes egne nettsider.</w:t>
+      </w:r>
+      <w:r>
+        <w:rPr>
           <w:b w:val="0"/>
           <w:i w:val="0"/>
         </w:rPr>
-        <w:t>Frister endres. Dette dokumentet er ajour per juli 2026, men klubben må alltid sjekke gjeldende utlysning før innsending. Ordningene som er merket «må verifiseres» er ikke kontrollert mot gjeldende regelverk.</w:t>
+        <w:t xml:space="preserve"> Seks av dem inneholdt feil. Det er grunnen til at ordet «Verifisert» er byttet ut med «Kontrollert» og en dato — et dokument som påstår at noe er verifisert, må kunne si når, og mot hva.</w:t>
+      </w:r>
+    </w:p>
+    <w:p>
+      <w:pPr>
+        <w:pStyle w:val="Heading3"/>
+      </w:pPr>
+      <w:r>
+        <w:rPr>
+          <w:b/>
+          <w:i w:val="0"/>
+          <w:color w:val="2F6B45"/>
+          <w:sz w:val="24"/>
+        </w:rPr>
+        <w:t>Feil som ble rettet</w:t>
+      </w:r>
+    </w:p>
+    <w:tbl>
+      <w:tblPr>
+        <w:tblStyle w:val="TableGrid"/>
+        <w:tblW w:type="auto" w:w="0"/>
+        <w:jc w:val="left"/>
+        <w:tblLook w:firstColumn="1" w:firstRow="1" w:lastColumn="0" w:lastRow="0" w:noHBand="0" w:noVBand="1" w:val="04A0"/>
+        <w:tblBorders>
+          <w:top w:val="single" w:sz="8" w:space="0" w:color="3A6B4A"/>
+          <w:left w:val="single" w:sz="4" w:space="0" w:color="3A6B4A"/>
+          <w:bottom w:val="single" w:sz="8" w:space="0" w:color="3A6B4A"/>
+          <w:right w:val="single" w:sz="4" w:space="0" w:color="3A6B4A"/>
+          <w:insideH w:val="single" w:sz="4" w:space="0" w:color="3A6B4A"/>
+          <w:insideV w:val="single" w:sz="4" w:space="0" w:color="3A6B4A"/>
+        </w:tblBorders>
+      </w:tblPr>
+      <w:tblGrid>
+        <w:gridCol w:w="3024"/>
+        <w:gridCol w:w="3024"/>
+        <w:gridCol w:w="3024"/>
+      </w:tblGrid>
+      <w:tr>
+        <w:trPr>
+          <w:cantSplit/>
+          <w:tblHeader w:val="true"/>
+        </w:trPr>
+        <w:tc>
+          <w:tcPr>
+            <w:tcW w:type="dxa" w:w="3024"/>
+            <w:shd w:val="clear" w:color="auto" w:fill="E9F2EC"/>
+          </w:tcPr>
+          <w:p>
+            <w:pPr>
+              <w:spacing w:before="60" w:after="60"/>
+            </w:pPr>
+            <w:r>
+              <w:rPr>
+                <w:b/>
+              </w:rPr>
+            </w:r>
+            <w:r>
+              <w:rPr>
+                <w:b/>
+                <w:i w:val="0"/>
+                <w:color w:val="14532D"/>
+                <w:sz w:val="21"/>
+              </w:rPr>
+              <w:t>Ordning</w:t>
+            </w:r>
+          </w:p>
+        </w:tc>
+        <w:tc>
+          <w:tcPr>
+            <w:tcW w:type="dxa" w:w="3024"/>
+            <w:shd w:val="clear" w:color="auto" w:fill="E9F2EC"/>
+          </w:tcPr>
+          <w:p>
+            <w:pPr>
+              <w:spacing w:before="60" w:after="60"/>
+            </w:pPr>
+            <w:r>
+              <w:rPr>
+                <w:b/>
+              </w:rPr>
+            </w:r>
+            <w:r>
+              <w:rPr>
+                <w:b/>
+                <w:i w:val="0"/>
+                <w:color w:val="14532D"/>
+                <w:sz w:val="21"/>
+              </w:rPr>
+              <w:t>Sto her før</w:t>
+            </w:r>
+          </w:p>
+        </w:tc>
+        <w:tc>
+          <w:tcPr>
+            <w:tcW w:type="dxa" w:w="3024"/>
+            <w:shd w:val="clear" w:color="auto" w:fill="E9F2EC"/>
+          </w:tcPr>
+          <w:p>
+            <w:pPr>
+              <w:spacing w:before="60" w:after="60"/>
+            </w:pPr>
+            <w:r>
+              <w:rPr>
+                <w:b/>
+              </w:rPr>
+            </w:r>
+            <w:r>
+              <w:rPr>
+                <w:b/>
+                <w:i w:val="0"/>
+                <w:color w:val="14532D"/>
+                <w:sz w:val="21"/>
+              </w:rPr>
+              <w:t>Kilden sier</w:t>
+            </w:r>
+          </w:p>
+        </w:tc>
+      </w:tr>
+      <w:tr>
+        <w:trPr>
+          <w:cantSplit/>
+        </w:trPr>
+        <w:tc>
+          <w:tcPr>
+            <w:tcW w:type="dxa" w:w="3024"/>
+          </w:tcPr>
+          <w:p>
+            <w:pPr>
+              <w:spacing w:before="60" w:after="60"/>
+            </w:pPr>
+            <w:r>
+              <w:rPr>
+                <w:sz w:val="21"/>
+              </w:rPr>
+            </w:r>
+            <w:r>
+              <w:rPr>
+                <w:b w:val="0"/>
+                <w:i w:val="0"/>
+                <w:sz w:val="21"/>
+              </w:rPr>
+              <w:t>Sparebankstiftelsen Helgeland</w:t>
+            </w:r>
+          </w:p>
+        </w:tc>
+        <w:tc>
+          <w:tcPr>
+            <w:tcW w:type="dxa" w:w="3024"/>
+          </w:tcPr>
+          <w:p>
+            <w:pPr>
+              <w:spacing w:before="60" w:after="60"/>
+            </w:pPr>
+            <w:r>
+              <w:rPr>
+                <w:sz w:val="21"/>
+              </w:rPr>
+            </w:r>
+            <w:r>
+              <w:rPr>
+                <w:b w:val="0"/>
+                <w:i w:val="0"/>
+                <w:sz w:val="21"/>
+              </w:rPr>
+              <w:t>Frister 15.03, 15.05, 15.08, 15.11</w:t>
+            </w:r>
+          </w:p>
+        </w:tc>
+        <w:tc>
+          <w:tcPr>
+            <w:tcW w:type="dxa" w:w="3024"/>
+          </w:tcPr>
+          <w:p>
+            <w:pPr>
+              <w:spacing w:before="60" w:after="60"/>
+            </w:pPr>
+            <w:r>
+              <w:rPr>
+                <w:sz w:val="21"/>
+              </w:rPr>
+            </w:r>
+            <w:r>
+              <w:rPr>
+                <w:b/>
+                <w:i w:val="0"/>
+                <w:sz w:val="21"/>
+              </w:rPr>
+              <w:t>21.02, 27.05, 02.09, 11.11.</w:t>
+            </w:r>
+            <w:r>
+              <w:rPr>
+                <w:b w:val="0"/>
+                <w:i w:val="0"/>
+                <w:sz w:val="21"/>
+              </w:rPr>
+              <w:t xml:space="preserve"> De gamle datoene var bankens Drivkraftstøtte, ført på feil aktør</w:t>
+            </w:r>
+          </w:p>
+        </w:tc>
+      </w:tr>
+      <w:tr>
+        <w:trPr>
+          <w:cantSplit/>
+        </w:trPr>
+        <w:tc>
+          <w:tcPr>
+            <w:tcW w:type="dxa" w:w="3024"/>
+            <w:shd w:val="clear" w:color="auto" w:fill="F5F9F6"/>
+          </w:tcPr>
+          <w:p>
+            <w:pPr>
+              <w:spacing w:before="60" w:after="60"/>
+            </w:pPr>
+            <w:r>
+              <w:rPr>
+                <w:sz w:val="21"/>
+              </w:rPr>
+            </w:r>
+            <w:r>
+              <w:rPr>
+                <w:b w:val="0"/>
+                <w:i w:val="0"/>
+                <w:sz w:val="21"/>
+              </w:rPr>
+              <w:t>SpareBank 1 Nord-Norge</w:t>
+            </w:r>
+          </w:p>
+        </w:tc>
+        <w:tc>
+          <w:tcPr>
+            <w:tcW w:type="dxa" w:w="3024"/>
+            <w:shd w:val="clear" w:color="auto" w:fill="F5F9F6"/>
+          </w:tcPr>
+          <w:p>
+            <w:pPr>
+              <w:spacing w:before="60" w:after="60"/>
+            </w:pPr>
+            <w:r>
+              <w:rPr>
+                <w:sz w:val="21"/>
+              </w:rPr>
+            </w:r>
+            <w:r>
+              <w:rPr>
+                <w:b w:val="0"/>
+                <w:i w:val="0"/>
+                <w:sz w:val="21"/>
+              </w:rPr>
+              <w:t>«Tre utlysninger i året»</w:t>
+            </w:r>
+          </w:p>
+        </w:tc>
+        <w:tc>
+          <w:tcPr>
+            <w:tcW w:type="dxa" w:w="3024"/>
+            <w:shd w:val="clear" w:color="auto" w:fill="F5F9F6"/>
+          </w:tcPr>
+          <w:p>
+            <w:pPr>
+              <w:spacing w:before="60" w:after="60"/>
+            </w:pPr>
+            <w:r>
+              <w:rPr>
+                <w:sz w:val="21"/>
+              </w:rPr>
+            </w:r>
+            <w:r>
+              <w:rPr>
+                <w:b/>
+                <w:i w:val="0"/>
+                <w:sz w:val="21"/>
+              </w:rPr>
+              <w:t>To</w:t>
+            </w:r>
+            <w:r>
+              <w:rPr>
+                <w:b w:val="0"/>
+                <w:i w:val="0"/>
+                <w:sz w:val="21"/>
+              </w:rPr>
+              <w:t xml:space="preserve"> — én vår, én høst. Tretallet står på et utdatert nettsted banken selv henviser bort fra</w:t>
+            </w:r>
+          </w:p>
+        </w:tc>
+      </w:tr>
+      <w:tr>
+        <w:trPr>
+          <w:cantSplit/>
+        </w:trPr>
+        <w:tc>
+          <w:tcPr>
+            <w:tcW w:type="dxa" w:w="3024"/>
+          </w:tcPr>
+          <w:p>
+            <w:pPr>
+              <w:spacing w:before="60" w:after="60"/>
+            </w:pPr>
+            <w:r>
+              <w:rPr>
+                <w:sz w:val="21"/>
+              </w:rPr>
+            </w:r>
+            <w:r>
+              <w:rPr>
+                <w:b w:val="0"/>
+                <w:i w:val="0"/>
+                <w:sz w:val="21"/>
+              </w:rPr>
+              <w:t>Gjensidigestiftelsen</w:t>
+            </w:r>
+          </w:p>
+        </w:tc>
+        <w:tc>
+          <w:tcPr>
+            <w:tcW w:type="dxa" w:w="3024"/>
+          </w:tcPr>
+          <w:p>
+            <w:pPr>
+              <w:spacing w:before="60" w:after="60"/>
+            </w:pPr>
+            <w:r>
+              <w:rPr>
+                <w:sz w:val="21"/>
+              </w:rPr>
+            </w:r>
+            <w:r>
+              <w:rPr>
+                <w:b w:val="0"/>
+                <w:i w:val="0"/>
+                <w:sz w:val="21"/>
+              </w:rPr>
+              <w:t>«Prosjektet må starte året etter»</w:t>
+            </w:r>
+          </w:p>
+        </w:tc>
+        <w:tc>
+          <w:tcPr>
+            <w:tcW w:type="dxa" w:w="3024"/>
+          </w:tcPr>
+          <w:p>
+            <w:pPr>
+              <w:spacing w:before="60" w:after="60"/>
+            </w:pPr>
+            <w:r>
+              <w:rPr>
+                <w:sz w:val="21"/>
+              </w:rPr>
+            </w:r>
+            <w:r>
+              <w:rPr>
+                <w:b/>
+                <w:i w:val="0"/>
+                <w:sz w:val="21"/>
+              </w:rPr>
+              <w:t>Tidligst 1. desember i søknadsåret</w:t>
+            </w:r>
+          </w:p>
+        </w:tc>
+      </w:tr>
+      <w:tr>
+        <w:trPr>
+          <w:cantSplit/>
+        </w:trPr>
+        <w:tc>
+          <w:tcPr>
+            <w:tcW w:type="dxa" w:w="3024"/>
+            <w:shd w:val="clear" w:color="auto" w:fill="F5F9F6"/>
+          </w:tcPr>
+          <w:p>
+            <w:pPr>
+              <w:spacing w:before="60" w:after="60"/>
+            </w:pPr>
+            <w:r>
+              <w:rPr>
+                <w:sz w:val="21"/>
+              </w:rPr>
+            </w:r>
+            <w:r>
+              <w:rPr>
+                <w:b w:val="0"/>
+                <w:i w:val="0"/>
+                <w:sz w:val="21"/>
+              </w:rPr>
+              <w:t>Gjensidigestiftelsen</w:t>
+            </w:r>
+          </w:p>
+        </w:tc>
+        <w:tc>
+          <w:tcPr>
+            <w:tcW w:type="dxa" w:w="3024"/>
+            <w:shd w:val="clear" w:color="auto" w:fill="F5F9F6"/>
+          </w:tcPr>
+          <w:p>
+            <w:pPr>
+              <w:spacing w:before="60" w:after="60"/>
+            </w:pPr>
+            <w:r>
+              <w:rPr>
+                <w:sz w:val="21"/>
+              </w:rPr>
+            </w:r>
+            <w:r>
+              <w:rPr>
+                <w:b w:val="0"/>
+                <w:i w:val="0"/>
+                <w:sz w:val="21"/>
+              </w:rPr>
+              <w:t>«Søknader som kun gjelder utstyrsinnkjøp får avslag»</w:t>
+            </w:r>
+          </w:p>
+        </w:tc>
+        <w:tc>
+          <w:tcPr>
+            <w:tcW w:type="dxa" w:w="3024"/>
+            <w:shd w:val="clear" w:color="auto" w:fill="F5F9F6"/>
+          </w:tcPr>
+          <w:p>
+            <w:pPr>
+              <w:spacing w:before="60" w:after="60"/>
+            </w:pPr>
+            <w:r>
+              <w:rPr>
+                <w:sz w:val="21"/>
+              </w:rPr>
+            </w:r>
+            <w:r>
+              <w:rPr>
+                <w:b w:val="0"/>
+                <w:i w:val="0"/>
+                <w:sz w:val="21"/>
+              </w:rPr>
+              <w:t xml:space="preserve">Utstyr og inventar er </w:t>
+            </w:r>
+            <w:r>
+              <w:rPr>
+                <w:b/>
+                <w:i w:val="0"/>
+                <w:sz w:val="21"/>
+              </w:rPr>
+              <w:t>støtteberettiget</w:t>
+            </w:r>
+            <w:r>
+              <w:rPr>
+                <w:b w:val="0"/>
+                <w:i w:val="0"/>
+                <w:sz w:val="21"/>
+              </w:rPr>
+              <w:t>. Regelen gjaldt 2025 og sto på et kvalifiseringsskjema</w:t>
+            </w:r>
+          </w:p>
+        </w:tc>
+      </w:tr>
+      <w:tr>
+        <w:trPr>
+          <w:cantSplit/>
+        </w:trPr>
+        <w:tc>
+          <w:tcPr>
+            <w:tcW w:type="dxa" w:w="3024"/>
+          </w:tcPr>
+          <w:p>
+            <w:pPr>
+              <w:spacing w:before="60" w:after="60"/>
+            </w:pPr>
+            <w:r>
+              <w:rPr>
+                <w:sz w:val="21"/>
+              </w:rPr>
+            </w:r>
+            <w:r>
+              <w:rPr>
+                <w:b w:val="0"/>
+                <w:i w:val="0"/>
+                <w:sz w:val="21"/>
+              </w:rPr>
+              <w:t>Sparebanken Norge</w:t>
+            </w:r>
+          </w:p>
+        </w:tc>
+        <w:tc>
+          <w:tcPr>
+            <w:tcW w:type="dxa" w:w="3024"/>
+          </w:tcPr>
+          <w:p>
+            <w:pPr>
+              <w:spacing w:before="60" w:after="60"/>
+            </w:pPr>
+            <w:r>
+              <w:rPr>
+                <w:sz w:val="21"/>
+              </w:rPr>
+            </w:r>
+            <w:r>
+              <w:rPr>
+                <w:b w:val="0"/>
+                <w:i w:val="0"/>
+                <w:sz w:val="21"/>
+              </w:rPr>
+              <w:t>Ett sett vinduer for «prosjektmidler og ildsjelmidler»</w:t>
+            </w:r>
+          </w:p>
+        </w:tc>
+        <w:tc>
+          <w:tcPr>
+            <w:tcW w:type="dxa" w:w="3024"/>
+          </w:tcPr>
+          <w:p>
+            <w:pPr>
+              <w:spacing w:before="60" w:after="60"/>
+            </w:pPr>
+            <w:r>
+              <w:rPr>
+                <w:sz w:val="21"/>
+              </w:rPr>
+            </w:r>
+            <w:r>
+              <w:rPr>
+                <w:b/>
+                <w:i w:val="0"/>
+                <w:sz w:val="21"/>
+              </w:rPr>
+              <w:t>To ulike ordninger</w:t>
+            </w:r>
+            <w:r>
+              <w:rPr>
+                <w:b w:val="0"/>
+                <w:i w:val="0"/>
+                <w:sz w:val="21"/>
+              </w:rPr>
+              <w:t xml:space="preserve"> med ulike vinduer, ulike tak og ulike penger bak</w:t>
+            </w:r>
+          </w:p>
+        </w:tc>
+      </w:tr>
+      <w:tr>
+        <w:trPr>
+          <w:cantSplit/>
+        </w:trPr>
+        <w:tc>
+          <w:tcPr>
+            <w:tcW w:type="dxa" w:w="3024"/>
+            <w:shd w:val="clear" w:color="auto" w:fill="F5F9F6"/>
+          </w:tcPr>
+          <w:p>
+            <w:pPr>
+              <w:spacing w:before="60" w:after="60"/>
+            </w:pPr>
+            <w:r>
+              <w:rPr>
+                <w:sz w:val="21"/>
+              </w:rPr>
+            </w:r>
+            <w:r>
+              <w:rPr>
+                <w:b w:val="0"/>
+                <w:i w:val="0"/>
+                <w:sz w:val="21"/>
+              </w:rPr>
+              <w:t>LAM</w:t>
+            </w:r>
+          </w:p>
+        </w:tc>
+        <w:tc>
+          <w:tcPr>
+            <w:tcW w:type="dxa" w:w="3024"/>
+            <w:shd w:val="clear" w:color="auto" w:fill="F5F9F6"/>
+          </w:tcPr>
+          <w:p>
+            <w:pPr>
+              <w:spacing w:before="60" w:after="60"/>
+            </w:pPr>
+            <w:r>
+              <w:rPr>
+                <w:sz w:val="21"/>
+              </w:rPr>
+            </w:r>
+            <w:r>
+              <w:rPr>
+                <w:b w:val="0"/>
+                <w:i w:val="0"/>
+                <w:sz w:val="21"/>
+              </w:rPr>
+              <w:t>«Ingen søknadsfrist — fordeles automatisk»</w:t>
+            </w:r>
+          </w:p>
+        </w:tc>
+        <w:tc>
+          <w:tcPr>
+            <w:tcW w:type="dxa" w:w="3024"/>
+            <w:shd w:val="clear" w:color="auto" w:fill="F5F9F6"/>
+          </w:tcPr>
+          <w:p>
+            <w:pPr>
+              <w:spacing w:before="60" w:after="60"/>
+            </w:pPr>
+            <w:r>
+              <w:rPr>
+                <w:sz w:val="21"/>
+              </w:rPr>
+            </w:r>
+            <w:r>
+              <w:rPr>
+                <w:b w:val="0"/>
+                <w:i w:val="0"/>
+                <w:sz w:val="21"/>
+              </w:rPr>
+              <w:t xml:space="preserve">NIF </w:t>
+            </w:r>
+            <w:r>
+              <w:rPr>
+                <w:b w:val="0"/>
+                <w:i/>
+                <w:sz w:val="21"/>
+              </w:rPr>
+              <w:t>anbefaler</w:t>
+            </w:r>
+            <w:r>
+              <w:rPr>
+                <w:b w:val="0"/>
+                <w:i w:val="0"/>
+                <w:sz w:val="21"/>
+              </w:rPr>
+              <w:t xml:space="preserve"> det, men mange idrettsråd har egen søknadsfrist</w:t>
+            </w:r>
+          </w:p>
+        </w:tc>
+      </w:tr>
+    </w:tbl>
+    <w:p>
+      <w:pPr>
+        <w:spacing w:after="120"/>
+      </w:pPr>
+    </w:p>
+    <w:p>
+      <w:pPr>
+        <w:pStyle w:val="Heading3"/>
+      </w:pPr>
+      <w:r>
+        <w:rPr>
+          <w:b/>
+          <w:i w:val="0"/>
+          <w:color w:val="2F6B45"/>
+          <w:sz w:val="24"/>
+        </w:rPr>
+        <w:t>Det som ikke lot seg bekrefte</w:t>
+      </w:r>
+    </w:p>
+    <w:p>
+      <w:pPr>
+        <w:pStyle w:val="ListBullet"/>
+      </w:pPr>
+      <w:r>
+        <w:rPr>
+          <w:b/>
+          <w:i w:val="0"/>
+        </w:rPr>
+        <w:t>Ingen 2027-frister er publisert</w:t>
+      </w:r>
+      <w:r>
+        <w:rPr>
+          <w:b w:val="0"/>
+          <w:i w:val="0"/>
+        </w:rPr>
+        <w:t xml:space="preserve"> for noen av ordningene. Datoene her gjelder 2026. Regn med at mønsteret gjentar seg, men ikke planlegg etter en 2027-dato før utlysningen er ute</w:t>
+      </w:r>
+    </w:p>
+    <w:p>
+      <w:pPr>
+        <w:pStyle w:val="ListBullet"/>
+      </w:pPr>
+      <w:r>
+        <w:rPr>
+          <w:b/>
+          <w:i w:val="0"/>
+        </w:rPr>
+        <w:t>Bufdirs frist for 2027</w:t>
+      </w:r>
+      <w:r>
+        <w:rPr>
+          <w:b w:val="0"/>
+          <w:i w:val="0"/>
+        </w:rPr>
+        <w:t xml:space="preserve"> er ukjent til utlysningen kommer midt i oktober</w:t>
+      </w:r>
+    </w:p>
+    <w:p>
+      <w:pPr>
+        <w:pStyle w:val="ListBullet"/>
+      </w:pPr>
+      <w:r>
+        <w:rPr>
+          <w:b/>
+          <w:i w:val="0"/>
+        </w:rPr>
+        <w:t>Sparebanken Norges vårfrist</w:t>
+      </w:r>
+      <w:r>
+        <w:rPr>
+          <w:b w:val="0"/>
+          <w:i w:val="0"/>
+        </w:rPr>
+        <w:t xml:space="preserve"> står som 15. april på bankens nyeste side og</w:t>
+      </w:r>
+    </w:p>
+    <w:p>
+      <w:pPr>
+        <w:pStyle w:val="ListNumber2"/>
+        <w:numPr>
+          <w:ilvl w:val="1"/>
+          <w:numId w:val="12"/>
+        </w:numPr>
+      </w:pPr>
+      <w:r>
+        <w:rPr>
+          <w:b w:val="0"/>
+          <w:i w:val="0"/>
+        </w:rPr>
+        <w:t>april på en eldre. Må avklares før den brukes</w:t>
+      </w:r>
+    </w:p>
+    <w:p>
+      <w:pPr>
+        <w:pStyle w:val="ListBullet"/>
+      </w:pPr>
+      <w:r>
+        <w:rPr>
+          <w:b/>
+          <w:i w:val="0"/>
+        </w:rPr>
+        <w:t xml:space="preserve">Søknadsportalen </w:t>
+      </w:r>
+      <w:r>
+        <w:rPr>
+          <w:rFonts w:ascii="Consolas" w:hAnsi="Consolas"/>
+          <w:b/>
+          <w:i w:val="0"/>
+          <w:sz w:val="19"/>
+        </w:rPr>
+        <w:t>prosjektmidler.spv.no</w:t>
+      </w:r>
+      <w:r>
+        <w:rPr>
+          <w:b/>
+          <w:i w:val="0"/>
+        </w:rPr>
+        <w:t xml:space="preserve"> svarte ikke</w:t>
+      </w:r>
+      <w:r>
+        <w:rPr>
+          <w:b w:val="0"/>
+          <w:i w:val="0"/>
+        </w:rPr>
+        <w:t xml:space="preserve"> da den ble forsøkt 14.09.2026, midt i et åpent søknadsvindu. Ring banken hvis den fortsatt er nede</w:t>
+      </w:r>
+    </w:p>
+    <w:p>
+      <w:pPr>
+        <w:pStyle w:val="ListBullet"/>
+      </w:pPr>
+      <w:r>
+        <w:rPr>
+          <w:b/>
+          <w:i w:val="0"/>
+        </w:rPr>
+        <w:t>Klubbens egen LAM-frist</w:t>
+      </w:r>
+      <w:r>
+        <w:rPr>
+          <w:b w:val="0"/>
+          <w:i w:val="0"/>
+        </w:rPr>
+        <w:t xml:space="preserve"> må hentes fra eget idrettsråd. Det finnes ingen nasjonal oversikt</w:t>
+      </w:r>
+    </w:p>
+    <w:p>
+      <w:pPr>
+        <w:pStyle w:val="Heading3"/>
+      </w:pPr>
+      <w:r>
+        <w:rPr>
+          <w:b/>
+          <w:i w:val="0"/>
+          <w:color w:val="2F6B45"/>
+          <w:sz w:val="24"/>
+        </w:rPr>
+        <w:t>Kilder</w:t>
       </w:r>
     </w:p>
     <w:p>
@@ -5208,7 +6884,23 @@
           <w:b w:val="0"/>
           <w:i w:val="0"/>
         </w:rPr>
-        <w:t>Har du funnet en feil, eller en ordning som mangler — gi beskjed, så oppdateres dokumentet for alle klubbene.</w:t>
+        <w:t>Bufdir, Gjensidigestiftelsen, Sparebankstiftelsen DNB, Sparebankstiftelsen Sparebanken Norge, Sparebanken Norge, SpareBank 1 SMN, Sparebankstiftelsen SMN, SpareBank 1 Nord-Norge, SpareBank 1 Helgeland, Sparebankstiftelsen Helgeland, Norges idrettsforbund og Lotteri- og stiftelsestilsynet — alle lest på organisasjonenes egne nettsider 14.09.2026.</w:t>
+      </w:r>
+    </w:p>
+    <w:p>
+      <w:r>
+        <w:rPr>
+          <w:b/>
+          <w:i w:val="0"/>
+        </w:rPr>
+        <w:t>Frister endres, og de endres uten at noen sier fra.</w:t>
+      </w:r>
+      <w:r>
+        <w:rPr>
+          <w:b w:val="0"/>
+          <w:i w:val="0"/>
+        </w:rPr>
+        <w:t xml:space="preserve"> Kontroller alltid mot ordningens egen utlysning før dere sender noe. Finner du en feil her, si fra, så rettes den for alle klubbene.</w:t>
       </w:r>
     </w:p>
     <w:p>
@@ -5636,6 +7328,9 @@
   </w:num>
   <w:num w:numId="11">
     <w:abstractNumId w:val="7"/>
+  </w:num>
+  <w:num w:numId="12">
+    <w:abstractNumId w:val="3"/>
   </w:num>
 </w:numbering>
 </file>

</xml_diff>